<commit_message>
Revert "Merge branch 'server' into feature_28"
This reverts commit af2b9f116f882a5abdb2410caa539991bad3702e, reversing
changes made to ad982a50200a0c1ce731fa846fecdff7d02d2c33.
</commit_message>
<xml_diff>
--- a/Proposal.docx
+++ b/Proposal.docx
@@ -415,13 +415,10 @@
               <w:tab w:val="right" w:leader="dot" w:pos="9016"/>
             </w:tabs>
             <w:rPr>
-              <w:rFonts w:eastAsiaTheme="minorEastAsia"/>
-              <w:b w:val="0"/>
-              <w:bCs w:val="0"/>
-              <w:caps w:val="0"/>
+              <w:rStyle w:val="ad"/>
               <w:noProof/>
-              <w:sz w:val="22"/>
-              <w:szCs w:val="24"/>
+              <w:sz w:val="32"/>
+              <w:szCs w:val="32"/>
             </w:rPr>
           </w:pPr>
           <w:r>
@@ -441,18 +438,22 @@
             </w:rPr>
             <w:fldChar w:fldCharType="separate"/>
           </w:r>
-          <w:hyperlink w:anchor="_Toc178151254" w:history="1">
+          <w:hyperlink w:anchor="_Toc176470545" w:history="1">
             <w:r>
               <w:rPr>
                 <w:rStyle w:val="ad"/>
                 <w:noProof/>
-              </w:rPr>
-              <w:t>게임 소개</w:t>
+                <w:sz w:val="32"/>
+                <w:szCs w:val="32"/>
+              </w:rPr>
+              <w:t>1. 게임 소개</w:t>
             </w:r>
             <w:r>
               <w:rPr>
                 <w:noProof/>
                 <w:webHidden/>
+                <w:sz w:val="32"/>
+                <w:szCs w:val="32"/>
               </w:rPr>
               <w:tab/>
             </w:r>
@@ -460,6 +461,8 @@
               <w:rPr>
                 <w:noProof/>
                 <w:webHidden/>
+                <w:sz w:val="32"/>
+                <w:szCs w:val="32"/>
               </w:rPr>
               <w:fldChar w:fldCharType="begin"/>
             </w:r>
@@ -467,19 +470,25 @@
               <w:rPr>
                 <w:noProof/>
                 <w:webHidden/>
-              </w:rPr>
-              <w:instrText xml:space="preserve"> PAGEREF _Toc178151254 \h </w:instrText>
+                <w:sz w:val="32"/>
+                <w:szCs w:val="32"/>
+              </w:rPr>
+              <w:instrText xml:space="preserve"> PAGEREF _Toc176470545 \h </w:instrText>
             </w:r>
             <w:r>
               <w:rPr>
                 <w:noProof/>
                 <w:webHidden/>
+                <w:sz w:val="32"/>
+                <w:szCs w:val="32"/>
               </w:rPr>
             </w:r>
             <w:r>
               <w:rPr>
                 <w:noProof/>
                 <w:webHidden/>
+                <w:sz w:val="32"/>
+                <w:szCs w:val="32"/>
               </w:rPr>
               <w:fldChar w:fldCharType="separate"/>
             </w:r>
@@ -487,6 +496,8 @@
               <w:rPr>
                 <w:noProof/>
                 <w:webHidden/>
+                <w:sz w:val="32"/>
+                <w:szCs w:val="32"/>
               </w:rPr>
               <w:t>- 1 -</w:t>
             </w:r>
@@ -494,6 +505,8 @@
               <w:rPr>
                 <w:noProof/>
                 <w:webHidden/>
+                <w:sz w:val="32"/>
+                <w:szCs w:val="32"/>
               </w:rPr>
               <w:fldChar w:fldCharType="end"/>
             </w:r>
@@ -501,567 +514,10 @@
         </w:p>
         <w:p>
           <w:pPr>
-            <w:pStyle w:val="20"/>
-            <w:tabs>
-              <w:tab w:val="left" w:pos="660"/>
-              <w:tab w:val="right" w:leader="dot" w:pos="9016"/>
-            </w:tabs>
             <w:rPr>
-              <w:rFonts w:eastAsiaTheme="minorEastAsia"/>
-              <w:smallCaps w:val="0"/>
-              <w:noProof/>
-              <w:sz w:val="22"/>
-              <w:szCs w:val="24"/>
+              <w:szCs w:val="22"/>
             </w:rPr>
           </w:pPr>
-          <w:hyperlink w:anchor="_Toc178151255" w:history="1">
-            <w:r>
-              <w:rPr>
-                <w:rStyle w:val="ad"/>
-                <w:b/>
-                <w:bCs/>
-                <w:noProof/>
-              </w:rPr>
-              <w:t>1.</w:t>
-            </w:r>
-            <w:r>
-              <w:rPr>
-                <w:rFonts w:eastAsiaTheme="minorEastAsia"/>
-                <w:smallCaps w:val="0"/>
-                <w:noProof/>
-                <w:sz w:val="22"/>
-                <w:szCs w:val="24"/>
-              </w:rPr>
-              <w:tab/>
-            </w:r>
-            <w:r>
-              <w:rPr>
-                <w:rStyle w:val="ad"/>
-                <w:b/>
-                <w:bCs/>
-                <w:noProof/>
-              </w:rPr>
-              <w:t>세계관</w:t>
-            </w:r>
-            <w:r>
-              <w:rPr>
-                <w:noProof/>
-                <w:webHidden/>
-              </w:rPr>
-              <w:tab/>
-            </w:r>
-            <w:r>
-              <w:rPr>
-                <w:noProof/>
-                <w:webHidden/>
-              </w:rPr>
-              <w:fldChar w:fldCharType="begin"/>
-            </w:r>
-            <w:r>
-              <w:rPr>
-                <w:noProof/>
-                <w:webHidden/>
-              </w:rPr>
-              <w:instrText xml:space="preserve"> PAGEREF _Toc178151255 \h </w:instrText>
-            </w:r>
-            <w:r>
-              <w:rPr>
-                <w:noProof/>
-                <w:webHidden/>
-              </w:rPr>
-            </w:r>
-            <w:r>
-              <w:rPr>
-                <w:noProof/>
-                <w:webHidden/>
-              </w:rPr>
-              <w:fldChar w:fldCharType="separate"/>
-            </w:r>
-            <w:r>
-              <w:rPr>
-                <w:noProof/>
-                <w:webHidden/>
-              </w:rPr>
-              <w:t>- 1 -</w:t>
-            </w:r>
-            <w:r>
-              <w:rPr>
-                <w:noProof/>
-                <w:webHidden/>
-              </w:rPr>
-              <w:fldChar w:fldCharType="end"/>
-            </w:r>
-          </w:hyperlink>
-        </w:p>
-        <w:p>
-          <w:pPr>
-            <w:pStyle w:val="20"/>
-            <w:tabs>
-              <w:tab w:val="left" w:pos="660"/>
-              <w:tab w:val="right" w:leader="dot" w:pos="9016"/>
-            </w:tabs>
-            <w:rPr>
-              <w:rFonts w:eastAsiaTheme="minorEastAsia"/>
-              <w:smallCaps w:val="0"/>
-              <w:noProof/>
-              <w:sz w:val="22"/>
-              <w:szCs w:val="24"/>
-            </w:rPr>
-          </w:pPr>
-          <w:hyperlink w:anchor="_Toc178151256" w:history="1">
-            <w:r>
-              <w:rPr>
-                <w:rStyle w:val="ad"/>
-                <w:b/>
-                <w:bCs/>
-                <w:noProof/>
-              </w:rPr>
-              <w:t>2.</w:t>
-            </w:r>
-            <w:r>
-              <w:rPr>
-                <w:rFonts w:eastAsiaTheme="minorEastAsia"/>
-                <w:smallCaps w:val="0"/>
-                <w:noProof/>
-                <w:sz w:val="22"/>
-                <w:szCs w:val="24"/>
-              </w:rPr>
-              <w:tab/>
-            </w:r>
-            <w:r>
-              <w:rPr>
-                <w:rStyle w:val="ad"/>
-                <w:b/>
-                <w:bCs/>
-                <w:noProof/>
-              </w:rPr>
-              <w:t>특징</w:t>
-            </w:r>
-            <w:r>
-              <w:rPr>
-                <w:noProof/>
-                <w:webHidden/>
-              </w:rPr>
-              <w:tab/>
-            </w:r>
-            <w:r>
-              <w:rPr>
-                <w:noProof/>
-                <w:webHidden/>
-              </w:rPr>
-              <w:fldChar w:fldCharType="begin"/>
-            </w:r>
-            <w:r>
-              <w:rPr>
-                <w:noProof/>
-                <w:webHidden/>
-              </w:rPr>
-              <w:instrText xml:space="preserve"> PAGEREF _Toc178151256 \h </w:instrText>
-            </w:r>
-            <w:r>
-              <w:rPr>
-                <w:noProof/>
-                <w:webHidden/>
-              </w:rPr>
-            </w:r>
-            <w:r>
-              <w:rPr>
-                <w:noProof/>
-                <w:webHidden/>
-              </w:rPr>
-              <w:fldChar w:fldCharType="separate"/>
-            </w:r>
-            <w:r>
-              <w:rPr>
-                <w:noProof/>
-                <w:webHidden/>
-              </w:rPr>
-              <w:t>- 1 -</w:t>
-            </w:r>
-            <w:r>
-              <w:rPr>
-                <w:noProof/>
-                <w:webHidden/>
-              </w:rPr>
-              <w:fldChar w:fldCharType="end"/>
-            </w:r>
-          </w:hyperlink>
-        </w:p>
-        <w:p>
-          <w:pPr>
-            <w:pStyle w:val="20"/>
-            <w:tabs>
-              <w:tab w:val="left" w:pos="660"/>
-              <w:tab w:val="right" w:leader="dot" w:pos="9016"/>
-            </w:tabs>
-            <w:rPr>
-              <w:rFonts w:eastAsiaTheme="minorEastAsia"/>
-              <w:smallCaps w:val="0"/>
-              <w:noProof/>
-              <w:sz w:val="22"/>
-              <w:szCs w:val="24"/>
-            </w:rPr>
-          </w:pPr>
-          <w:hyperlink w:anchor="_Toc178151257" w:history="1">
-            <w:r>
-              <w:rPr>
-                <w:rStyle w:val="ad"/>
-                <w:b/>
-                <w:bCs/>
-                <w:noProof/>
-              </w:rPr>
-              <w:t>3.</w:t>
-            </w:r>
-            <w:r>
-              <w:rPr>
-                <w:rFonts w:eastAsiaTheme="minorEastAsia"/>
-                <w:smallCaps w:val="0"/>
-                <w:noProof/>
-                <w:sz w:val="22"/>
-                <w:szCs w:val="24"/>
-              </w:rPr>
-              <w:tab/>
-            </w:r>
-            <w:r>
-              <w:rPr>
-                <w:rStyle w:val="ad"/>
-                <w:b/>
-                <w:bCs/>
-                <w:noProof/>
-              </w:rPr>
-              <w:t>임무</w:t>
-            </w:r>
-            <w:r>
-              <w:rPr>
-                <w:noProof/>
-                <w:webHidden/>
-              </w:rPr>
-              <w:tab/>
-            </w:r>
-            <w:r>
-              <w:rPr>
-                <w:noProof/>
-                <w:webHidden/>
-              </w:rPr>
-              <w:fldChar w:fldCharType="begin"/>
-            </w:r>
-            <w:r>
-              <w:rPr>
-                <w:noProof/>
-                <w:webHidden/>
-              </w:rPr>
-              <w:instrText xml:space="preserve"> PAGEREF _Toc178151257 \h </w:instrText>
-            </w:r>
-            <w:r>
-              <w:rPr>
-                <w:noProof/>
-                <w:webHidden/>
-              </w:rPr>
-            </w:r>
-            <w:r>
-              <w:rPr>
-                <w:noProof/>
-                <w:webHidden/>
-              </w:rPr>
-              <w:fldChar w:fldCharType="separate"/>
-            </w:r>
-            <w:r>
-              <w:rPr>
-                <w:noProof/>
-                <w:webHidden/>
-              </w:rPr>
-              <w:t>- 2 -</w:t>
-            </w:r>
-            <w:r>
-              <w:rPr>
-                <w:noProof/>
-                <w:webHidden/>
-              </w:rPr>
-              <w:fldChar w:fldCharType="end"/>
-            </w:r>
-          </w:hyperlink>
-        </w:p>
-        <w:p>
-          <w:pPr>
-            <w:pStyle w:val="20"/>
-            <w:tabs>
-              <w:tab w:val="left" w:pos="660"/>
-              <w:tab w:val="right" w:leader="dot" w:pos="9016"/>
-            </w:tabs>
-            <w:rPr>
-              <w:rFonts w:eastAsiaTheme="minorEastAsia"/>
-              <w:smallCaps w:val="0"/>
-              <w:noProof/>
-              <w:sz w:val="22"/>
-              <w:szCs w:val="24"/>
-            </w:rPr>
-          </w:pPr>
-          <w:hyperlink w:anchor="_Toc178151258" w:history="1">
-            <w:r>
-              <w:rPr>
-                <w:rStyle w:val="ad"/>
-                <w:b/>
-                <w:bCs/>
-                <w:noProof/>
-              </w:rPr>
-              <w:t>4.</w:t>
-            </w:r>
-            <w:r>
-              <w:rPr>
-                <w:rFonts w:eastAsiaTheme="minorEastAsia"/>
-                <w:smallCaps w:val="0"/>
-                <w:noProof/>
-                <w:sz w:val="22"/>
-                <w:szCs w:val="24"/>
-              </w:rPr>
-              <w:tab/>
-            </w:r>
-            <w:r>
-              <w:rPr>
-                <w:rStyle w:val="ad"/>
-                <w:b/>
-                <w:bCs/>
-                <w:noProof/>
-              </w:rPr>
-              <w:t>단위</w:t>
-            </w:r>
-            <w:r>
-              <w:rPr>
-                <w:noProof/>
-                <w:webHidden/>
-              </w:rPr>
-              <w:tab/>
-            </w:r>
-            <w:r>
-              <w:rPr>
-                <w:noProof/>
-                <w:webHidden/>
-              </w:rPr>
-              <w:fldChar w:fldCharType="begin"/>
-            </w:r>
-            <w:r>
-              <w:rPr>
-                <w:noProof/>
-                <w:webHidden/>
-              </w:rPr>
-              <w:instrText xml:space="preserve"> PAGEREF _Toc178151258 \h </w:instrText>
-            </w:r>
-            <w:r>
-              <w:rPr>
-                <w:noProof/>
-                <w:webHidden/>
-              </w:rPr>
-            </w:r>
-            <w:r>
-              <w:rPr>
-                <w:noProof/>
-                <w:webHidden/>
-              </w:rPr>
-              <w:fldChar w:fldCharType="separate"/>
-            </w:r>
-            <w:r>
-              <w:rPr>
-                <w:noProof/>
-                <w:webHidden/>
-              </w:rPr>
-              <w:t>- 2 -</w:t>
-            </w:r>
-            <w:r>
-              <w:rPr>
-                <w:noProof/>
-                <w:webHidden/>
-              </w:rPr>
-              <w:fldChar w:fldCharType="end"/>
-            </w:r>
-          </w:hyperlink>
-        </w:p>
-        <w:p>
-          <w:pPr>
-            <w:pStyle w:val="20"/>
-            <w:tabs>
-              <w:tab w:val="left" w:pos="660"/>
-              <w:tab w:val="right" w:leader="dot" w:pos="9016"/>
-            </w:tabs>
-            <w:rPr>
-              <w:rFonts w:eastAsiaTheme="minorEastAsia"/>
-              <w:smallCaps w:val="0"/>
-              <w:noProof/>
-              <w:sz w:val="22"/>
-              <w:szCs w:val="24"/>
-            </w:rPr>
-          </w:pPr>
-          <w:hyperlink w:anchor="_Toc178151259" w:history="1">
-            <w:r>
-              <w:rPr>
-                <w:rStyle w:val="ad"/>
-                <w:b/>
-                <w:bCs/>
-                <w:noProof/>
-              </w:rPr>
-              <w:t>5.</w:t>
-            </w:r>
-            <w:r>
-              <w:rPr>
-                <w:rFonts w:eastAsiaTheme="minorEastAsia"/>
-                <w:smallCaps w:val="0"/>
-                <w:noProof/>
-                <w:sz w:val="22"/>
-                <w:szCs w:val="24"/>
-              </w:rPr>
-              <w:tab/>
-            </w:r>
-            <w:r>
-              <w:rPr>
-                <w:rStyle w:val="ad"/>
-                <w:b/>
-                <w:bCs/>
-                <w:noProof/>
-              </w:rPr>
-              <w:t>스테이지</w:t>
-            </w:r>
-            <w:r>
-              <w:rPr>
-                <w:noProof/>
-                <w:webHidden/>
-              </w:rPr>
-              <w:tab/>
-            </w:r>
-            <w:r>
-              <w:rPr>
-                <w:noProof/>
-                <w:webHidden/>
-              </w:rPr>
-              <w:fldChar w:fldCharType="begin"/>
-            </w:r>
-            <w:r>
-              <w:rPr>
-                <w:noProof/>
-                <w:webHidden/>
-              </w:rPr>
-              <w:instrText xml:space="preserve"> PAGEREF _Toc178151259 \h </w:instrText>
-            </w:r>
-            <w:r>
-              <w:rPr>
-                <w:noProof/>
-                <w:webHidden/>
-              </w:rPr>
-            </w:r>
-            <w:r>
-              <w:rPr>
-                <w:noProof/>
-                <w:webHidden/>
-              </w:rPr>
-              <w:fldChar w:fldCharType="separate"/>
-            </w:r>
-            <w:r>
-              <w:rPr>
-                <w:noProof/>
-                <w:webHidden/>
-              </w:rPr>
-              <w:t>- 2 -</w:t>
-            </w:r>
-            <w:r>
-              <w:rPr>
-                <w:noProof/>
-                <w:webHidden/>
-              </w:rPr>
-              <w:fldChar w:fldCharType="end"/>
-            </w:r>
-          </w:hyperlink>
-        </w:p>
-        <w:p>
-          <w:pPr>
-            <w:pStyle w:val="20"/>
-            <w:tabs>
-              <w:tab w:val="left" w:pos="660"/>
-              <w:tab w:val="right" w:leader="dot" w:pos="9016"/>
-            </w:tabs>
-            <w:rPr>
-              <w:rFonts w:eastAsiaTheme="minorEastAsia"/>
-              <w:smallCaps w:val="0"/>
-              <w:noProof/>
-              <w:sz w:val="22"/>
-              <w:szCs w:val="24"/>
-            </w:rPr>
-          </w:pPr>
-          <w:hyperlink w:anchor="_Toc178151260" w:history="1">
-            <w:r>
-              <w:rPr>
-                <w:rStyle w:val="ad"/>
-                <w:b/>
-                <w:bCs/>
-                <w:noProof/>
-              </w:rPr>
-              <w:t>6.</w:t>
-            </w:r>
-            <w:r>
-              <w:rPr>
-                <w:rFonts w:eastAsiaTheme="minorEastAsia"/>
-                <w:smallCaps w:val="0"/>
-                <w:noProof/>
-                <w:sz w:val="22"/>
-                <w:szCs w:val="24"/>
-              </w:rPr>
-              <w:tab/>
-            </w:r>
-            <w:r>
-              <w:rPr>
-                <w:rStyle w:val="ad"/>
-                <w:b/>
-                <w:bCs/>
-                <w:noProof/>
-              </w:rPr>
-              <w:t>캐릭터</w:t>
-            </w:r>
-            <w:r>
-              <w:rPr>
-                <w:noProof/>
-                <w:webHidden/>
-              </w:rPr>
-              <w:tab/>
-            </w:r>
-            <w:r>
-              <w:rPr>
-                <w:noProof/>
-                <w:webHidden/>
-              </w:rPr>
-              <w:fldChar w:fldCharType="begin"/>
-            </w:r>
-            <w:r>
-              <w:rPr>
-                <w:noProof/>
-                <w:webHidden/>
-              </w:rPr>
-              <w:instrText xml:space="preserve"> PAGEREF _Toc178151260 \h </w:instrText>
-            </w:r>
-            <w:r>
-              <w:rPr>
-                <w:noProof/>
-                <w:webHidden/>
-              </w:rPr>
-            </w:r>
-            <w:r>
-              <w:rPr>
-                <w:noProof/>
-                <w:webHidden/>
-              </w:rPr>
-              <w:fldChar w:fldCharType="separate"/>
-            </w:r>
-            <w:r>
-              <w:rPr>
-                <w:noProof/>
-                <w:webHidden/>
-              </w:rPr>
-              <w:t>- 3 -</w:t>
-            </w:r>
-            <w:r>
-              <w:rPr>
-                <w:noProof/>
-                <w:webHidden/>
-              </w:rPr>
-              <w:fldChar w:fldCharType="end"/>
-            </w:r>
-          </w:hyperlink>
         </w:p>
         <w:p>
           <w:pPr>
@@ -1070,27 +526,28 @@
               <w:tab w:val="right" w:leader="dot" w:pos="9016"/>
             </w:tabs>
             <w:rPr>
-              <w:rFonts w:eastAsiaTheme="minorEastAsia"/>
-              <w:b w:val="0"/>
-              <w:bCs w:val="0"/>
-              <w:caps w:val="0"/>
+              <w:rStyle w:val="ad"/>
               <w:noProof/>
-              <w:sz w:val="22"/>
-              <w:szCs w:val="24"/>
+              <w:sz w:val="32"/>
+              <w:szCs w:val="32"/>
             </w:rPr>
           </w:pPr>
-          <w:hyperlink w:anchor="_Toc178151261" w:history="1">
+          <w:hyperlink w:anchor="_Toc176470546" w:history="1">
             <w:r>
               <w:rPr>
                 <w:rStyle w:val="ad"/>
                 <w:noProof/>
-              </w:rPr>
-              <w:t>개발 환경</w:t>
+                <w:sz w:val="32"/>
+                <w:szCs w:val="32"/>
+              </w:rPr>
+              <w:t>2. 개발 환경</w:t>
             </w:r>
             <w:r>
               <w:rPr>
                 <w:noProof/>
                 <w:webHidden/>
+                <w:sz w:val="32"/>
+                <w:szCs w:val="32"/>
               </w:rPr>
               <w:tab/>
             </w:r>
@@ -1098,6 +555,8 @@
               <w:rPr>
                 <w:noProof/>
                 <w:webHidden/>
+                <w:sz w:val="32"/>
+                <w:szCs w:val="32"/>
               </w:rPr>
               <w:fldChar w:fldCharType="begin"/>
             </w:r>
@@ -1105,19 +564,25 @@
               <w:rPr>
                 <w:noProof/>
                 <w:webHidden/>
-              </w:rPr>
-              <w:instrText xml:space="preserve"> PAGEREF _Toc178151261 \h </w:instrText>
+                <w:sz w:val="32"/>
+                <w:szCs w:val="32"/>
+              </w:rPr>
+              <w:instrText xml:space="preserve"> PAGEREF _Toc176470546 \h </w:instrText>
             </w:r>
             <w:r>
               <w:rPr>
                 <w:noProof/>
                 <w:webHidden/>
+                <w:sz w:val="32"/>
+                <w:szCs w:val="32"/>
               </w:rPr>
             </w:r>
             <w:r>
               <w:rPr>
                 <w:noProof/>
                 <w:webHidden/>
+                <w:sz w:val="32"/>
+                <w:szCs w:val="32"/>
               </w:rPr>
               <w:fldChar w:fldCharType="separate"/>
             </w:r>
@@ -1125,17 +590,28 @@
               <w:rPr>
                 <w:noProof/>
                 <w:webHidden/>
-              </w:rPr>
-              <w:t>- 5 -</w:t>
+                <w:sz w:val="32"/>
+                <w:szCs w:val="32"/>
+              </w:rPr>
+              <w:t>- 2 -</w:t>
             </w:r>
             <w:r>
               <w:rPr>
                 <w:noProof/>
                 <w:webHidden/>
+                <w:sz w:val="32"/>
+                <w:szCs w:val="32"/>
               </w:rPr>
               <w:fldChar w:fldCharType="end"/>
             </w:r>
           </w:hyperlink>
+        </w:p>
+        <w:p>
+          <w:pPr>
+            <w:rPr>
+              <w:szCs w:val="22"/>
+            </w:rPr>
+          </w:pPr>
         </w:p>
         <w:p>
           <w:pPr>
@@ -1144,27 +620,28 @@
               <w:tab w:val="right" w:leader="dot" w:pos="9016"/>
             </w:tabs>
             <w:rPr>
-              <w:rFonts w:eastAsiaTheme="minorEastAsia"/>
-              <w:b w:val="0"/>
-              <w:bCs w:val="0"/>
-              <w:caps w:val="0"/>
+              <w:rStyle w:val="ad"/>
               <w:noProof/>
-              <w:sz w:val="22"/>
-              <w:szCs w:val="24"/>
+              <w:sz w:val="32"/>
+              <w:szCs w:val="32"/>
             </w:rPr>
           </w:pPr>
-          <w:hyperlink w:anchor="_Toc178151262" w:history="1">
+          <w:hyperlink w:anchor="_Toc176470547" w:history="1">
             <w:r>
               <w:rPr>
                 <w:rStyle w:val="ad"/>
                 <w:noProof/>
-              </w:rPr>
-              <w:t>연구 목적 및 중점 연구 분야</w:t>
+                <w:sz w:val="32"/>
+                <w:szCs w:val="32"/>
+              </w:rPr>
+              <w:t>3. 연구 목적</w:t>
             </w:r>
             <w:r>
               <w:rPr>
                 <w:noProof/>
                 <w:webHidden/>
+                <w:sz w:val="32"/>
+                <w:szCs w:val="32"/>
               </w:rPr>
               <w:tab/>
             </w:r>
@@ -1172,6 +649,8 @@
               <w:rPr>
                 <w:noProof/>
                 <w:webHidden/>
+                <w:sz w:val="32"/>
+                <w:szCs w:val="32"/>
               </w:rPr>
               <w:fldChar w:fldCharType="begin"/>
             </w:r>
@@ -1179,19 +658,25 @@
               <w:rPr>
                 <w:noProof/>
                 <w:webHidden/>
-              </w:rPr>
-              <w:instrText xml:space="preserve"> PAGEREF _Toc178151262 \h </w:instrText>
+                <w:sz w:val="32"/>
+                <w:szCs w:val="32"/>
+              </w:rPr>
+              <w:instrText xml:space="preserve"> PAGEREF _Toc176470547 \h </w:instrText>
             </w:r>
             <w:r>
               <w:rPr>
                 <w:noProof/>
                 <w:webHidden/>
+                <w:sz w:val="32"/>
+                <w:szCs w:val="32"/>
               </w:rPr>
             </w:r>
             <w:r>
               <w:rPr>
                 <w:noProof/>
                 <w:webHidden/>
+                <w:sz w:val="32"/>
+                <w:szCs w:val="32"/>
               </w:rPr>
               <w:fldChar w:fldCharType="separate"/>
             </w:r>
@@ -1199,17 +684,28 @@
               <w:rPr>
                 <w:noProof/>
                 <w:webHidden/>
-              </w:rPr>
-              <w:t>- 5 -</w:t>
+                <w:sz w:val="32"/>
+                <w:szCs w:val="32"/>
+              </w:rPr>
+              <w:t>- 3 -</w:t>
             </w:r>
             <w:r>
               <w:rPr>
                 <w:noProof/>
                 <w:webHidden/>
+                <w:sz w:val="32"/>
+                <w:szCs w:val="32"/>
               </w:rPr>
               <w:fldChar w:fldCharType="end"/>
             </w:r>
           </w:hyperlink>
+        </w:p>
+        <w:p>
+          <w:pPr>
+            <w:rPr>
+              <w:szCs w:val="22"/>
+            </w:rPr>
+          </w:pPr>
         </w:p>
         <w:p>
           <w:pPr>
@@ -1218,27 +714,28 @@
               <w:tab w:val="right" w:leader="dot" w:pos="9016"/>
             </w:tabs>
             <w:rPr>
-              <w:rFonts w:eastAsiaTheme="minorEastAsia"/>
-              <w:b w:val="0"/>
-              <w:bCs w:val="0"/>
-              <w:caps w:val="0"/>
+              <w:rStyle w:val="ad"/>
               <w:noProof/>
-              <w:sz w:val="22"/>
-              <w:szCs w:val="24"/>
+              <w:sz w:val="32"/>
+              <w:szCs w:val="32"/>
             </w:rPr>
           </w:pPr>
-          <w:hyperlink w:anchor="_Toc178151263" w:history="1">
+          <w:hyperlink w:anchor="_Toc176470548" w:history="1">
             <w:r>
               <w:rPr>
                 <w:rStyle w:val="ad"/>
                 <w:noProof/>
-              </w:rPr>
-              <w:t>개발 일정</w:t>
+                <w:sz w:val="32"/>
+                <w:szCs w:val="32"/>
+              </w:rPr>
+              <w:t>4. 중점 연구 분야</w:t>
             </w:r>
             <w:r>
               <w:rPr>
                 <w:noProof/>
                 <w:webHidden/>
+                <w:sz w:val="32"/>
+                <w:szCs w:val="32"/>
               </w:rPr>
               <w:tab/>
             </w:r>
@@ -1246,6 +743,8 @@
               <w:rPr>
                 <w:noProof/>
                 <w:webHidden/>
+                <w:sz w:val="32"/>
+                <w:szCs w:val="32"/>
               </w:rPr>
               <w:fldChar w:fldCharType="begin"/>
             </w:r>
@@ -1253,19 +752,25 @@
               <w:rPr>
                 <w:noProof/>
                 <w:webHidden/>
-              </w:rPr>
-              <w:instrText xml:space="preserve"> PAGEREF _Toc178151263 \h </w:instrText>
+                <w:sz w:val="32"/>
+                <w:szCs w:val="32"/>
+              </w:rPr>
+              <w:instrText xml:space="preserve"> PAGEREF _Toc176470548 \h </w:instrText>
             </w:r>
             <w:r>
               <w:rPr>
                 <w:noProof/>
                 <w:webHidden/>
+                <w:sz w:val="32"/>
+                <w:szCs w:val="32"/>
               </w:rPr>
             </w:r>
             <w:r>
               <w:rPr>
                 <w:noProof/>
                 <w:webHidden/>
+                <w:sz w:val="32"/>
+                <w:szCs w:val="32"/>
               </w:rPr>
               <w:fldChar w:fldCharType="separate"/>
             </w:r>
@@ -1273,18 +778,117 @@
               <w:rPr>
                 <w:noProof/>
                 <w:webHidden/>
-              </w:rPr>
-              <w:t>- 6 -</w:t>
+                <w:sz w:val="32"/>
+                <w:szCs w:val="32"/>
+              </w:rPr>
+              <w:t>- 4 -</w:t>
             </w:r>
             <w:r>
               <w:rPr>
                 <w:noProof/>
                 <w:webHidden/>
+                <w:sz w:val="32"/>
+                <w:szCs w:val="32"/>
               </w:rPr>
               <w:fldChar w:fldCharType="end"/>
             </w:r>
           </w:hyperlink>
         </w:p>
+        <w:p>
+          <w:pPr>
+            <w:rPr>
+              <w:szCs w:val="22"/>
+            </w:rPr>
+          </w:pPr>
+        </w:p>
+        <w:p>
+          <w:pPr>
+            <w:pStyle w:val="10"/>
+            <w:tabs>
+              <w:tab w:val="right" w:leader="dot" w:pos="9016"/>
+            </w:tabs>
+            <w:rPr>
+              <w:rStyle w:val="ad"/>
+              <w:noProof/>
+              <w:sz w:val="32"/>
+              <w:szCs w:val="32"/>
+            </w:rPr>
+          </w:pPr>
+          <w:hyperlink w:anchor="_Toc176470549" w:history="1">
+            <w:r>
+              <w:rPr>
+                <w:rStyle w:val="ad"/>
+                <w:noProof/>
+                <w:sz w:val="32"/>
+                <w:szCs w:val="32"/>
+              </w:rPr>
+              <w:t>5. 개발 일정</w:t>
+            </w:r>
+            <w:r>
+              <w:rPr>
+                <w:noProof/>
+                <w:webHidden/>
+                <w:sz w:val="32"/>
+                <w:szCs w:val="32"/>
+              </w:rPr>
+              <w:tab/>
+            </w:r>
+            <w:r>
+              <w:rPr>
+                <w:noProof/>
+                <w:webHidden/>
+                <w:sz w:val="32"/>
+                <w:szCs w:val="32"/>
+              </w:rPr>
+              <w:fldChar w:fldCharType="begin"/>
+            </w:r>
+            <w:r>
+              <w:rPr>
+                <w:noProof/>
+                <w:webHidden/>
+                <w:sz w:val="32"/>
+                <w:szCs w:val="32"/>
+              </w:rPr>
+              <w:instrText xml:space="preserve"> PAGEREF _Toc176470549 \h </w:instrText>
+            </w:r>
+            <w:r>
+              <w:rPr>
+                <w:noProof/>
+                <w:webHidden/>
+                <w:sz w:val="32"/>
+                <w:szCs w:val="32"/>
+              </w:rPr>
+            </w:r>
+            <w:r>
+              <w:rPr>
+                <w:noProof/>
+                <w:webHidden/>
+                <w:sz w:val="32"/>
+                <w:szCs w:val="32"/>
+              </w:rPr>
+              <w:fldChar w:fldCharType="separate"/>
+            </w:r>
+            <w:r>
+              <w:rPr>
+                <w:noProof/>
+                <w:webHidden/>
+                <w:sz w:val="32"/>
+                <w:szCs w:val="32"/>
+              </w:rPr>
+              <w:t>- 5 -</w:t>
+            </w:r>
+            <w:r>
+              <w:rPr>
+                <w:noProof/>
+                <w:webHidden/>
+                <w:sz w:val="32"/>
+                <w:szCs w:val="32"/>
+              </w:rPr>
+              <w:fldChar w:fldCharType="end"/>
+            </w:r>
+          </w:hyperlink>
+        </w:p>
+        <w:p/>
         <w:p>
           <w:r>
             <w:rPr>
@@ -1333,6 +937,7 @@
           <w:szCs w:val="48"/>
         </w:rPr>
       </w:pPr>
+      <w:bookmarkStart w:id="0" w:name="_Toc176470545"/>
       <w:r>
         <w:rPr>
           <w:rFonts w:hint="eastAsia"/>
@@ -1344,7 +949,6 @@
         <w:lastRenderedPageBreak/>
         <w:t xml:space="preserve"> </w:t>
       </w:r>
-      <w:bookmarkStart w:id="0" w:name="_Toc178151254"/>
       <w:r>
         <w:rPr>
           <w:rFonts w:hint="eastAsia"/>
@@ -1473,8 +1077,8 @@
       <w:pPr>
         <w:pStyle w:val="a6"/>
         <w:numPr>
-          <w:ilvl w:val="0"/>
-          <w:numId w:val="21"/>
+          <w:ilvl w:val="1"/>
+          <w:numId w:val="15"/>
         </w:numPr>
         <w:spacing w:line="276" w:lineRule="auto"/>
         <w:jc w:val="both"/>
@@ -1485,7 +1089,6 @@
           <w:szCs w:val="22"/>
         </w:rPr>
       </w:pPr>
-      <w:bookmarkStart w:id="1" w:name="_Toc178151255"/>
       <w:r>
         <w:rPr>
           <w:rFonts w:hint="eastAsia"/>
@@ -1495,7 +1098,6 @@
         </w:rPr>
         <w:t>세계관</w:t>
       </w:r>
-      <w:bookmarkEnd w:id="1"/>
     </w:p>
     <w:p>
       <w:pPr>
@@ -1607,8 +1209,8 @@
       <w:pPr>
         <w:pStyle w:val="a6"/>
         <w:numPr>
-          <w:ilvl w:val="0"/>
-          <w:numId w:val="21"/>
+          <w:ilvl w:val="1"/>
+          <w:numId w:val="15"/>
         </w:numPr>
         <w:spacing w:line="276" w:lineRule="auto"/>
         <w:jc w:val="both"/>
@@ -1619,7 +1221,6 @@
           <w:szCs w:val="22"/>
         </w:rPr>
       </w:pPr>
-      <w:bookmarkStart w:id="2" w:name="_Toc178151256"/>
       <w:r>
         <w:rPr>
           <w:rFonts w:hint="eastAsia"/>
@@ -1629,7 +1230,6 @@
         </w:rPr>
         <w:t>특징</w:t>
       </w:r>
-      <w:bookmarkEnd w:id="2"/>
     </w:p>
     <w:p>
       <w:pPr>
@@ -2098,53 +1698,62 @@
               <w:spacing w:line="276" w:lineRule="auto"/>
               <w:jc w:val="center"/>
               <w:rPr>
-                <w:sz w:val="16"/>
-                <w:szCs w:val="16"/>
+                <w:sz w:val="18"/>
+                <w:szCs w:val="18"/>
               </w:rPr>
             </w:pPr>
             <w:r>
               <w:rPr>
-                <w:sz w:val="16"/>
-                <w:szCs w:val="16"/>
+                <w:sz w:val="18"/>
+                <w:szCs w:val="18"/>
               </w:rPr>
               <w:t>SSE</w:t>
             </w:r>
             <w:r>
               <w:rPr>
-                <w:sz w:val="16"/>
-                <w:szCs w:val="16"/>
-              </w:rPr>
-              <w:t>4.1</w:t>
-            </w:r>
-            <w:r>
-              <w:rPr>
-                <w:sz w:val="16"/>
-                <w:szCs w:val="16"/>
+                <w:rFonts w:hint="eastAsia"/>
+                <w:sz w:val="18"/>
+                <w:szCs w:val="18"/>
+              </w:rPr>
+              <w:t>2</w:t>
+            </w:r>
+            <w:r>
+              <w:rPr>
+                <w:sz w:val="18"/>
+                <w:szCs w:val="18"/>
               </w:rPr>
               <w:t xml:space="preserve"> </w:t>
             </w:r>
             <w:r>
               <w:rPr>
                 <w:rFonts w:hint="eastAsia"/>
-                <w:sz w:val="16"/>
-                <w:szCs w:val="16"/>
+                <w:sz w:val="18"/>
+                <w:szCs w:val="18"/>
               </w:rPr>
               <w:t xml:space="preserve">명령어 지원 </w:t>
             </w:r>
             <w:r>
               <w:rPr>
-                <w:sz w:val="16"/>
-                <w:szCs w:val="16"/>
+                <w:sz w:val="18"/>
+                <w:szCs w:val="18"/>
               </w:rPr>
               <w:t>x86_64</w:t>
             </w:r>
             <w:r>
               <w:rPr>
                 <w:rFonts w:hint="eastAsia"/>
-                <w:sz w:val="16"/>
-                <w:szCs w:val="16"/>
-              </w:rPr>
-              <w:t xml:space="preserve"> 아키텍처</w:t>
+                <w:sz w:val="18"/>
+                <w:szCs w:val="18"/>
+              </w:rPr>
+              <w:t xml:space="preserve"> 아키텍</w:t>
+            </w:r>
+            <w:r>
+              <w:rPr>
+                <w:rFonts w:hint="eastAsia"/>
+                <w:sz w:val="18"/>
+                <w:szCs w:val="18"/>
+              </w:rPr>
+              <w:t>처</w:t>
             </w:r>
           </w:p>
           <w:p>
@@ -2345,8 +1954,8 @@
       <w:pPr>
         <w:pStyle w:val="a6"/>
         <w:numPr>
-          <w:ilvl w:val="0"/>
-          <w:numId w:val="21"/>
+          <w:ilvl w:val="1"/>
+          <w:numId w:val="15"/>
         </w:numPr>
         <w:spacing w:line="276" w:lineRule="auto"/>
         <w:jc w:val="both"/>
@@ -2357,7 +1966,6 @@
           <w:szCs w:val="22"/>
         </w:rPr>
       </w:pPr>
-      <w:bookmarkStart w:id="3" w:name="_Toc178151257"/>
       <w:r>
         <w:rPr>
           <w:rFonts w:hint="eastAsia"/>
@@ -2368,17 +1976,17 @@
         <w:lastRenderedPageBreak/>
         <w:t>임무</w:t>
       </w:r>
-      <w:bookmarkEnd w:id="3"/>
     </w:p>
     <w:p>
       <w:pPr>
         <w:pStyle w:val="a6"/>
         <w:numPr>
-          <w:ilvl w:val="1"/>
-          <w:numId w:val="21"/>
+          <w:ilvl w:val="2"/>
+          <w:numId w:val="15"/>
         </w:numPr>
         <w:spacing w:line="276" w:lineRule="auto"/>
         <w:jc w:val="both"/>
+        <w:outlineLvl w:val="2"/>
         <w:rPr>
           <w:b/>
           <w:bCs/>
@@ -2386,16 +1994,6 @@
           <w:szCs w:val="20"/>
         </w:rPr>
       </w:pPr>
-      <w:r>
-        <w:rPr>
-          <w:rFonts w:hint="eastAsia"/>
-          <w:b/>
-          <w:bCs/>
-          <w:sz w:val="20"/>
-          <w:szCs w:val="20"/>
-        </w:rPr>
-        <w:t xml:space="preserve"> </w:t>
-      </w:r>
       <w:r>
         <w:rPr>
           <w:rFonts w:hint="eastAsia"/>
@@ -2497,11 +2095,12 @@
       <w:pPr>
         <w:pStyle w:val="a6"/>
         <w:numPr>
-          <w:ilvl w:val="1"/>
-          <w:numId w:val="21"/>
+          <w:ilvl w:val="2"/>
+          <w:numId w:val="15"/>
         </w:numPr>
         <w:spacing w:line="276" w:lineRule="auto"/>
         <w:jc w:val="both"/>
+        <w:outlineLvl w:val="2"/>
         <w:rPr>
           <w:b/>
           <w:bCs/>
@@ -2509,16 +2108,6 @@
           <w:szCs w:val="20"/>
         </w:rPr>
       </w:pPr>
-      <w:r>
-        <w:rPr>
-          <w:rFonts w:hint="eastAsia"/>
-          <w:b/>
-          <w:bCs/>
-          <w:sz w:val="20"/>
-          <w:szCs w:val="20"/>
-        </w:rPr>
-        <w:t xml:space="preserve"> </w:t>
-      </w:r>
       <w:r>
         <w:rPr>
           <w:rFonts w:hint="eastAsia"/>
@@ -2585,10 +2174,20 @@
     </w:p>
     <w:p>
       <w:pPr>
+        <w:spacing w:line="276" w:lineRule="auto"/>
+        <w:jc w:val="both"/>
+        <w:rPr>
+          <w:sz w:val="20"/>
+          <w:szCs w:val="20"/>
+        </w:rPr>
+      </w:pPr>
+    </w:p>
+    <w:p>
+      <w:pPr>
         <w:pStyle w:val="a6"/>
         <w:numPr>
-          <w:ilvl w:val="0"/>
-          <w:numId w:val="21"/>
+          <w:ilvl w:val="1"/>
+          <w:numId w:val="15"/>
         </w:numPr>
         <w:spacing w:line="276" w:lineRule="auto"/>
         <w:jc w:val="both"/>
@@ -2599,7 +2198,6 @@
           <w:szCs w:val="22"/>
         </w:rPr>
       </w:pPr>
-      <w:bookmarkStart w:id="4" w:name="_Toc178151258"/>
       <w:r>
         <w:rPr>
           <w:rFonts w:hint="eastAsia"/>
@@ -2607,139 +2205,81 @@
           <w:bCs/>
           <w:szCs w:val="22"/>
         </w:rPr>
-        <w:t>단위</w:t>
-      </w:r>
-      <w:bookmarkEnd w:id="4"/>
-    </w:p>
-    <w:tbl>
-      <w:tblPr>
-        <w:tblStyle w:val="af0"/>
-        <w:tblW w:w="0" w:type="auto"/>
-        <w:tblInd w:w="580" w:type="dxa"/>
-        <w:tblLook w:val="04A0" w:firstRow="1" w:lastRow="0" w:firstColumn="1" w:lastColumn="0" w:noHBand="0" w:noVBand="1"/>
-      </w:tblPr>
-      <w:tblGrid>
-        <w:gridCol w:w="4206"/>
-        <w:gridCol w:w="4230"/>
-      </w:tblGrid>
-      <w:tr>
-        <w:tc>
-          <w:tcPr>
-            <w:tcW w:w="4508" w:type="dxa"/>
-            <w:vAlign w:val="center"/>
-          </w:tcPr>
-          <w:p>
-            <w:pPr>
-              <w:pStyle w:val="a6"/>
-              <w:spacing w:line="276" w:lineRule="auto"/>
-              <w:ind w:left="0"/>
-              <w:jc w:val="center"/>
-              <w:rPr>
-                <w:sz w:val="20"/>
-                <w:szCs w:val="20"/>
-              </w:rPr>
-            </w:pPr>
-            <w:r>
-              <w:rPr>
-                <w:rFonts w:hint="eastAsia"/>
-                <w:sz w:val="20"/>
-                <w:szCs w:val="20"/>
-              </w:rPr>
-              <w:t xml:space="preserve">캐릭터 모델 </w:t>
-            </w:r>
-            <w:r>
-              <w:rPr>
-                <w:rFonts w:hint="eastAsia"/>
-                <w:sz w:val="20"/>
-                <w:szCs w:val="20"/>
-              </w:rPr>
-              <w:t>면적</w:t>
-            </w:r>
-          </w:p>
-        </w:tc>
-        <w:tc>
-          <w:tcPr>
-            <w:tcW w:w="4508" w:type="dxa"/>
-            <w:vAlign w:val="center"/>
-          </w:tcPr>
-          <w:p>
-            <w:pPr>
-              <w:pStyle w:val="a6"/>
-              <w:spacing w:line="276" w:lineRule="auto"/>
-              <w:ind w:left="0"/>
-              <w:jc w:val="center"/>
-              <w:rPr>
-                <w:sz w:val="20"/>
-                <w:szCs w:val="20"/>
-              </w:rPr>
-            </w:pPr>
-            <w:r>
-              <w:rPr>
-                <w:sz w:val="20"/>
-                <w:szCs w:val="20"/>
-              </w:rPr>
-              <w:t>1m x 1m</w:t>
-            </w:r>
-          </w:p>
-        </w:tc>
-      </w:tr>
-      <w:tr>
-        <w:tc>
-          <w:tcPr>
-            <w:tcW w:w="4508" w:type="dxa"/>
-            <w:vAlign w:val="center"/>
-          </w:tcPr>
-          <w:p>
-            <w:pPr>
-              <w:pStyle w:val="a6"/>
-              <w:spacing w:line="276" w:lineRule="auto"/>
-              <w:ind w:left="0"/>
-              <w:jc w:val="center"/>
-              <w:rPr>
-                <w:sz w:val="20"/>
-                <w:szCs w:val="20"/>
-              </w:rPr>
-            </w:pPr>
-            <w:r>
-              <w:rPr>
-                <w:rFonts w:hint="eastAsia"/>
-                <w:sz w:val="20"/>
-                <w:szCs w:val="20"/>
-              </w:rPr>
-              <w:t>월드 공간 단위</w:t>
-            </w:r>
-          </w:p>
-        </w:tc>
-        <w:tc>
-          <w:tcPr>
-            <w:tcW w:w="4508" w:type="dxa"/>
-            <w:vAlign w:val="center"/>
-          </w:tcPr>
-          <w:p>
-            <w:pPr>
-              <w:pStyle w:val="a6"/>
-              <w:spacing w:line="276" w:lineRule="auto"/>
-              <w:ind w:left="0"/>
-              <w:jc w:val="center"/>
-              <w:rPr>
-                <w:sz w:val="20"/>
-                <w:szCs w:val="20"/>
-              </w:rPr>
-            </w:pPr>
-            <w:r>
-              <w:rPr>
-                <w:sz w:val="20"/>
-                <w:szCs w:val="20"/>
-              </w:rPr>
-              <w:t>meter</w:t>
-            </w:r>
-          </w:p>
-        </w:tc>
-      </w:tr>
-    </w:tbl>
+        <w:t>캐릭터</w:t>
+      </w:r>
+    </w:p>
     <w:p>
       <w:pPr>
         <w:spacing w:line="276" w:lineRule="auto"/>
+        <w:ind w:leftChars="200" w:left="440"/>
+        <w:jc w:val="both"/>
+        <w:rPr>
+          <w:sz w:val="20"/>
+          <w:szCs w:val="20"/>
+        </w:rPr>
+      </w:pPr>
+      <w:r>
+        <w:rPr>
+          <w:sz w:val="20"/>
+          <w:szCs w:val="20"/>
+        </w:rPr>
+        <w:t>“Blue Archive”</w:t>
+      </w:r>
+      <w:proofErr w:type="spellStart"/>
+      <w:r>
+        <w:rPr>
+          <w:rFonts w:hint="eastAsia"/>
+          <w:sz w:val="20"/>
+          <w:szCs w:val="20"/>
+        </w:rPr>
+        <w:t>에</w:t>
+      </w:r>
+      <w:proofErr w:type="spellEnd"/>
+      <w:r>
+        <w:rPr>
+          <w:rFonts w:hint="eastAsia"/>
+          <w:sz w:val="20"/>
+          <w:szCs w:val="20"/>
+        </w:rPr>
+        <w:t xml:space="preserve"> 등장하는 </w:t>
+      </w:r>
+      <w:r>
+        <w:rPr>
+          <w:rFonts w:hint="eastAsia"/>
+          <w:sz w:val="20"/>
+          <w:szCs w:val="20"/>
+        </w:rPr>
+        <w:t xml:space="preserve">학생들 중 최소 </w:t>
+      </w:r>
+      <w:r>
+        <w:rPr>
+          <w:rFonts w:hint="eastAsia"/>
+          <w:sz w:val="20"/>
+          <w:szCs w:val="20"/>
+        </w:rPr>
+        <w:t>5</w:t>
+      </w:r>
+      <w:r>
+        <w:rPr>
+          <w:rFonts w:hint="eastAsia"/>
+          <w:sz w:val="20"/>
+          <w:szCs w:val="20"/>
+        </w:rPr>
+        <w:t xml:space="preserve">명 </w:t>
+      </w:r>
+      <w:r>
+        <w:rPr>
+          <w:rFonts w:hint="eastAsia"/>
+          <w:sz w:val="20"/>
+          <w:szCs w:val="20"/>
+        </w:rPr>
+        <w:t>이상 구현</w:t>
+      </w:r>
+    </w:p>
+    <w:p>
+      <w:pPr>
+        <w:spacing w:line="276" w:lineRule="auto"/>
+        <w:ind w:leftChars="200" w:left="440"/>
         <w:jc w:val="both"/>
         <w:rPr>
           <w:sz w:val="20"/>
@@ -2751,65 +2291,28 @@
       <w:pPr>
         <w:pStyle w:val="a6"/>
         <w:numPr>
-          <w:ilvl w:val="0"/>
-          <w:numId w:val="21"/>
+          <w:ilvl w:val="2"/>
+          <w:numId w:val="15"/>
         </w:numPr>
         <w:spacing w:line="276" w:lineRule="auto"/>
         <w:jc w:val="both"/>
-        <w:outlineLvl w:val="1"/>
+        <w:outlineLvl w:val="2"/>
         <w:rPr>
           <w:b/>
           <w:bCs/>
-          <w:szCs w:val="22"/>
-        </w:rPr>
-      </w:pPr>
-      <w:bookmarkStart w:id="5" w:name="_Toc178151259"/>
+          <w:sz w:val="20"/>
+          <w:szCs w:val="20"/>
+        </w:rPr>
+      </w:pPr>
       <w:r>
         <w:rPr>
           <w:rFonts w:hint="eastAsia"/>
           <w:b/>
           <w:bCs/>
-          <w:szCs w:val="22"/>
-        </w:rPr>
-        <w:t>스테이지</w:t>
-      </w:r>
-      <w:bookmarkEnd w:id="5"/>
-    </w:p>
-    <w:p>
-      <w:pPr>
-        <w:pStyle w:val="a6"/>
-        <w:numPr>
-          <w:ilvl w:val="1"/>
-          <w:numId w:val="21"/>
-        </w:numPr>
-        <w:spacing w:line="276" w:lineRule="auto"/>
-        <w:jc w:val="both"/>
-        <w:rPr>
-          <w:b/>
-          <w:bCs/>
-          <w:sz w:val="20"/>
-          <w:szCs w:val="20"/>
-        </w:rPr>
-      </w:pPr>
-      <w:r>
-        <w:rPr>
-          <w:rFonts w:hint="eastAsia"/>
-          <w:b/>
-          <w:bCs/>
-          <w:sz w:val="20"/>
-          <w:szCs w:val="20"/>
-        </w:rPr>
-        <w:t xml:space="preserve"> </w:t>
-      </w:r>
-      <w:r>
-        <w:rPr>
-          <w:rFonts w:hint="eastAsia"/>
-          <w:b/>
-          <w:bCs/>
-          <w:sz w:val="20"/>
-          <w:szCs w:val="20"/>
-        </w:rPr>
-        <w:t>시가지</w:t>
+          <w:sz w:val="20"/>
+          <w:szCs w:val="20"/>
+        </w:rPr>
+        <w:t>스킬</w:t>
       </w:r>
     </w:p>
     <w:p>
@@ -2820,534 +2323,249 @@
         <w:jc w:val="both"/>
         <w:rPr>
           <w:sz w:val="20"/>
-          <w:szCs w:val="21"/>
+          <w:szCs w:val="20"/>
         </w:rPr>
       </w:pPr>
       <w:r>
         <w:rPr>
           <w:rFonts w:hint="eastAsia"/>
           <w:sz w:val="20"/>
-          <w:szCs w:val="21"/>
-        </w:rPr>
-        <w:t>지형 구조</w:t>
-      </w:r>
-    </w:p>
-    <w:tbl>
-      <w:tblPr>
-        <w:tblStyle w:val="af0"/>
-        <w:tblW w:w="0" w:type="auto"/>
-        <w:tblInd w:w="1160" w:type="dxa"/>
-        <w:tblCellMar>
-          <w:left w:w="0" w:type="dxa"/>
-          <w:right w:w="0" w:type="dxa"/>
-        </w:tblCellMar>
-        <w:tblLook w:val="04A0" w:firstRow="1" w:lastRow="0" w:firstColumn="1" w:lastColumn="0" w:noHBand="0" w:noVBand="1"/>
-      </w:tblPr>
-      <w:tblGrid>
-        <w:gridCol w:w="1963"/>
-        <w:gridCol w:w="1248"/>
-        <w:gridCol w:w="1248"/>
-        <w:gridCol w:w="3397"/>
-      </w:tblGrid>
-      <w:tr>
-        <w:tc>
-          <w:tcPr>
-            <w:tcW w:w="0" w:type="auto"/>
-            <w:gridSpan w:val="4"/>
-            <w:vAlign w:val="center"/>
-          </w:tcPr>
-          <w:p>
-            <w:pPr>
-              <w:pStyle w:val="a6"/>
-              <w:spacing w:line="276" w:lineRule="auto"/>
-              <w:ind w:left="0"/>
-              <w:jc w:val="center"/>
-              <w:rPr>
-                <w:sz w:val="20"/>
-                <w:szCs w:val="21"/>
-              </w:rPr>
-            </w:pPr>
-            <w:r>
-              <w:rPr>
-                <w:noProof/>
-              </w:rPr>
-              <w:drawing>
-                <wp:inline distT="0" distB="0" distL="0" distR="0" wp14:anchorId="36A64C44" wp14:editId="24C89516">
-                  <wp:extent cx="3606800" cy="1429868"/>
-                  <wp:effectExtent l="0" t="0" r="0" b="5715"/>
-                  <wp:docPr id="1568133958" name="그림 3" descr="그래픽, 스크린샷, 그래픽 디자인, 클립아트이(가) 표시된 사진&#10;&#10;자동 생성된 설명"/>
-                  <wp:cNvGraphicFramePr>
-                    <a:graphicFrameLocks xmlns:a="http://schemas.openxmlformats.org/drawingml/2006/main" noChangeAspect="1"/>
-                  </wp:cNvGraphicFramePr>
-                  <a:graphic xmlns:a="http://schemas.openxmlformats.org/drawingml/2006/main">
-                    <a:graphicData uri="http://schemas.openxmlformats.org/drawingml/2006/picture">
-                      <pic:pic xmlns:pic="http://schemas.openxmlformats.org/drawingml/2006/picture">
-                        <pic:nvPicPr>
-                          <pic:cNvPr id="1568133958" name="그림 3" descr="그래픽, 스크린샷, 그래픽 디자인, 클립아트이(가) 표시된 사진&#10;&#10;자동 생성된 설명"/>
-                          <pic:cNvPicPr/>
-                        </pic:nvPicPr>
-                        <pic:blipFill>
-                          <a:blip r:embed="rId11" cstate="print">
-                            <a:extLst>
-                              <a:ext uri="{28A0092B-C50C-407E-A947-70E740481C1C}">
-                                <a14:useLocalDpi xmlns:a14="http://schemas.microsoft.com/office/drawing/2010/main" val="0"/>
-                              </a:ext>
-                            </a:extLst>
-                          </a:blip>
-                          <a:stretch>
-                            <a:fillRect/>
-                          </a:stretch>
-                        </pic:blipFill>
-                        <pic:spPr>
-                          <a:xfrm>
-                            <a:off x="0" y="0"/>
-                            <a:ext cx="3738177" cy="1481951"/>
-                          </a:xfrm>
-                          <a:prstGeom prst="rect">
-                            <a:avLst/>
-                          </a:prstGeom>
-                        </pic:spPr>
-                      </pic:pic>
-                    </a:graphicData>
-                  </a:graphic>
-                </wp:inline>
-              </w:drawing>
-            </w:r>
-          </w:p>
-        </w:tc>
-      </w:tr>
-      <w:tr>
-        <w:tc>
-          <w:tcPr>
-            <w:tcW w:w="0" w:type="auto"/>
-            <w:gridSpan w:val="2"/>
-            <w:vAlign w:val="center"/>
-          </w:tcPr>
-          <w:p>
-            <w:pPr>
-              <w:pStyle w:val="a6"/>
-              <w:spacing w:line="276" w:lineRule="auto"/>
-              <w:ind w:left="0"/>
-              <w:jc w:val="center"/>
-              <w:rPr>
-                <w:sz w:val="20"/>
-                <w:szCs w:val="21"/>
-              </w:rPr>
-            </w:pPr>
-            <w:r>
-              <w:rPr>
-                <w:rFonts w:hint="eastAsia"/>
-                <w:sz w:val="20"/>
-                <w:szCs w:val="21"/>
-              </w:rPr>
-              <w:t>사용 임무</w:t>
-            </w:r>
-          </w:p>
-        </w:tc>
-        <w:tc>
-          <w:tcPr>
-            <w:tcW w:w="0" w:type="auto"/>
-            <w:gridSpan w:val="2"/>
-            <w:vAlign w:val="center"/>
-          </w:tcPr>
-          <w:p>
-            <w:pPr>
-              <w:pStyle w:val="a6"/>
-              <w:spacing w:line="276" w:lineRule="auto"/>
-              <w:ind w:left="0"/>
-              <w:jc w:val="center"/>
-              <w:rPr>
-                <w:sz w:val="20"/>
-                <w:szCs w:val="21"/>
-              </w:rPr>
-            </w:pPr>
-            <w:r>
-              <w:rPr>
-                <w:rFonts w:hint="eastAsia"/>
-                <w:sz w:val="20"/>
-                <w:szCs w:val="21"/>
-              </w:rPr>
-              <w:t>종합전술시험</w:t>
-            </w:r>
-          </w:p>
-        </w:tc>
-      </w:tr>
-      <w:tr>
-        <w:tc>
-          <w:tcPr>
-            <w:tcW w:w="0" w:type="auto"/>
-            <w:gridSpan w:val="2"/>
-            <w:vAlign w:val="center"/>
-          </w:tcPr>
-          <w:p>
-            <w:pPr>
-              <w:pStyle w:val="a6"/>
-              <w:spacing w:line="276" w:lineRule="auto"/>
-              <w:ind w:left="0"/>
-              <w:jc w:val="center"/>
-              <w:rPr>
-                <w:sz w:val="20"/>
-                <w:szCs w:val="21"/>
-              </w:rPr>
-            </w:pPr>
-            <w:r>
-              <w:rPr>
-                <w:rFonts w:hint="eastAsia"/>
-                <w:sz w:val="20"/>
-                <w:szCs w:val="21"/>
-              </w:rPr>
-              <w:t>면적</w:t>
-            </w:r>
-          </w:p>
-        </w:tc>
-        <w:tc>
-          <w:tcPr>
-            <w:tcW w:w="0" w:type="auto"/>
-            <w:gridSpan w:val="2"/>
-            <w:vAlign w:val="center"/>
-          </w:tcPr>
-          <w:p>
-            <w:pPr>
-              <w:pStyle w:val="a6"/>
-              <w:spacing w:line="276" w:lineRule="auto"/>
-              <w:ind w:left="0"/>
-              <w:jc w:val="center"/>
-              <w:rPr>
-                <w:sz w:val="20"/>
-                <w:szCs w:val="21"/>
-              </w:rPr>
-            </w:pPr>
-            <w:r>
-              <w:rPr>
-                <w:rFonts w:hint="eastAsia"/>
-                <w:sz w:val="20"/>
-                <w:szCs w:val="21"/>
-              </w:rPr>
-              <w:t>80</w:t>
-            </w:r>
-            <w:r>
-              <w:rPr>
-                <w:sz w:val="20"/>
-                <w:szCs w:val="21"/>
-              </w:rPr>
-              <w:t xml:space="preserve">m x </w:t>
-            </w:r>
-            <w:r>
-              <w:rPr>
-                <w:rFonts w:hint="eastAsia"/>
-                <w:sz w:val="20"/>
-                <w:szCs w:val="21"/>
-              </w:rPr>
-              <w:t>31.25</w:t>
-            </w:r>
-            <w:r>
-              <w:rPr>
-                <w:sz w:val="20"/>
-                <w:szCs w:val="21"/>
-              </w:rPr>
-              <w:t>m</w:t>
-            </w:r>
-          </w:p>
-        </w:tc>
-      </w:tr>
-      <w:tr>
-        <w:tc>
-          <w:tcPr>
-            <w:tcW w:w="0" w:type="auto"/>
-            <w:gridSpan w:val="4"/>
-            <w:vAlign w:val="center"/>
-          </w:tcPr>
-          <w:p>
-            <w:pPr>
-              <w:pStyle w:val="a6"/>
-              <w:spacing w:line="276" w:lineRule="auto"/>
-              <w:ind w:left="0"/>
-              <w:jc w:val="center"/>
-              <w:rPr>
-                <w:sz w:val="20"/>
-                <w:szCs w:val="21"/>
-              </w:rPr>
-            </w:pPr>
-            <w:r>
-              <w:rPr>
-                <w:rFonts w:hint="eastAsia"/>
-                <w:sz w:val="20"/>
-                <w:szCs w:val="21"/>
-              </w:rPr>
-              <w:t>예시 이미지</w:t>
-            </w:r>
-          </w:p>
-        </w:tc>
-      </w:tr>
-      <w:tr>
-        <w:tc>
-          <w:tcPr>
-            <w:tcW w:w="0" w:type="auto"/>
-            <w:vAlign w:val="center"/>
-          </w:tcPr>
-          <w:p>
-            <w:pPr>
-              <w:pStyle w:val="a6"/>
-              <w:spacing w:line="276" w:lineRule="auto"/>
-              <w:ind w:left="0"/>
-              <w:jc w:val="center"/>
-              <w:rPr>
-                <w:sz w:val="20"/>
-                <w:szCs w:val="21"/>
-              </w:rPr>
-            </w:pPr>
-            <w:r>
-              <w:rPr>
-                <w:noProof/>
-              </w:rPr>
-              <w:drawing>
-                <wp:inline distT="0" distB="0" distL="0" distR="0" wp14:anchorId="1BB435CF" wp14:editId="6B810091">
-                  <wp:extent cx="1119600" cy="1080000"/>
-                  <wp:effectExtent l="0" t="0" r="0" b="0"/>
-                  <wp:docPr id="2052" name="Picture 4" descr="언론사뷰">
-                    <a:extLst xmlns:a="http://schemas.openxmlformats.org/drawingml/2006/main">
-                      <a:ext uri="{FF2B5EF4-FFF2-40B4-BE49-F238E27FC236}">
-                        <a16:creationId xmlns:a16="http://schemas.microsoft.com/office/drawing/2014/main" id="{631A484B-8C16-36E7-6B5B-67D6E967023E}"/>
-                      </a:ext>
-                    </a:extLst>
-                  </wp:docPr>
-                  <wp:cNvGraphicFramePr>
-                    <a:graphicFrameLocks xmlns:a="http://schemas.openxmlformats.org/drawingml/2006/main" noChangeAspect="1"/>
-                  </wp:cNvGraphicFramePr>
-                  <a:graphic xmlns:a="http://schemas.openxmlformats.org/drawingml/2006/main">
-                    <a:graphicData uri="http://schemas.openxmlformats.org/drawingml/2006/picture">
-                      <pic:pic xmlns:pic="http://schemas.openxmlformats.org/drawingml/2006/picture">
-                        <pic:nvPicPr>
-                          <pic:cNvPr id="2052" name="Picture 4" descr="언론사뷰">
-                            <a:extLst>
-                              <a:ext uri="{FF2B5EF4-FFF2-40B4-BE49-F238E27FC236}">
-                                <a16:creationId xmlns:a16="http://schemas.microsoft.com/office/drawing/2014/main" id="{631A484B-8C16-36E7-6B5B-67D6E967023E}"/>
-                              </a:ext>
-                            </a:extLst>
-                          </pic:cNvPr>
-                          <pic:cNvPicPr>
-                            <a:picLocks noChangeAspect="1" noChangeArrowheads="1"/>
-                          </pic:cNvPicPr>
-                        </pic:nvPicPr>
-                        <pic:blipFill rotWithShape="1">
-                          <a:blip r:embed="rId12" cstate="print">
-                            <a:extLst>
-                              <a:ext uri="{28A0092B-C50C-407E-A947-70E740481C1C}">
-                                <a14:useLocalDpi xmlns:a14="http://schemas.microsoft.com/office/drawing/2010/main" val="0"/>
-                              </a:ext>
-                            </a:extLst>
-                          </a:blip>
-                          <a:srcRect l="7882" r="54485" b="23103"/>
-                          <a:stretch/>
-                        </pic:blipFill>
-                        <pic:spPr bwMode="auto">
-                          <a:xfrm>
-                            <a:off x="0" y="0"/>
-                            <a:ext cx="1119600" cy="1080000"/>
-                          </a:xfrm>
-                          <a:prstGeom prst="rect">
-                            <a:avLst/>
-                          </a:prstGeom>
-                          <a:noFill/>
-                          <a:ln>
-                            <a:noFill/>
-                          </a:ln>
-                          <a:extLst>
-                            <a:ext uri="{53640926-AAD7-44D8-BBD7-CCE9431645EC}">
-                              <a14:shadowObscured xmlns:a14="http://schemas.microsoft.com/office/drawing/2010/main"/>
-                            </a:ext>
-                          </a:extLst>
-                        </pic:spPr>
-                      </pic:pic>
-                    </a:graphicData>
-                  </a:graphic>
-                </wp:inline>
-              </w:drawing>
-            </w:r>
-          </w:p>
-        </w:tc>
-        <w:tc>
-          <w:tcPr>
-            <w:tcW w:w="0" w:type="auto"/>
-            <w:gridSpan w:val="2"/>
-            <w:vAlign w:val="center"/>
-          </w:tcPr>
-          <w:p>
-            <w:pPr>
-              <w:pStyle w:val="a6"/>
-              <w:spacing w:line="276" w:lineRule="auto"/>
-              <w:ind w:left="0"/>
-              <w:jc w:val="center"/>
-              <w:rPr>
-                <w:sz w:val="20"/>
-                <w:szCs w:val="21"/>
-              </w:rPr>
-            </w:pPr>
-            <w:r>
-              <w:rPr>
-                <w:noProof/>
-              </w:rPr>
-              <w:drawing>
-                <wp:inline distT="0" distB="0" distL="0" distR="0" wp14:anchorId="0D4ADECA" wp14:editId="0C5192DE">
-                  <wp:extent cx="1674000" cy="1080000"/>
-                  <wp:effectExtent l="0" t="0" r="2540" b="0"/>
-                  <wp:docPr id="2050" name="Picture 2" descr="덕심 자극하는 신작 '블루 아카이브' 첫 인상은? &lt; 취재·기획 &lt; 기사본문 - 게임플">
-                    <a:extLst xmlns:a="http://schemas.openxmlformats.org/drawingml/2006/main">
-                      <a:ext uri="{FF2B5EF4-FFF2-40B4-BE49-F238E27FC236}">
-                        <a16:creationId xmlns:a16="http://schemas.microsoft.com/office/drawing/2014/main" id="{17B272FC-154B-0F51-79EF-80DF0F0C0B21}"/>
-                      </a:ext>
-                    </a:extLst>
-                  </wp:docPr>
-                  <wp:cNvGraphicFramePr>
-                    <a:graphicFrameLocks xmlns:a="http://schemas.openxmlformats.org/drawingml/2006/main" noChangeAspect="1"/>
-                  </wp:cNvGraphicFramePr>
-                  <a:graphic xmlns:a="http://schemas.openxmlformats.org/drawingml/2006/main">
-                    <a:graphicData uri="http://schemas.openxmlformats.org/drawingml/2006/picture">
-                      <pic:pic xmlns:pic="http://schemas.openxmlformats.org/drawingml/2006/picture">
-                        <pic:nvPicPr>
-                          <pic:cNvPr id="2050" name="Picture 2" descr="덕심 자극하는 신작 '블루 아카이브' 첫 인상은? &lt; 취재·기획 &lt; 기사본문 - 게임플">
-                            <a:extLst>
-                              <a:ext uri="{FF2B5EF4-FFF2-40B4-BE49-F238E27FC236}">
-                                <a16:creationId xmlns:a16="http://schemas.microsoft.com/office/drawing/2014/main" id="{17B272FC-154B-0F51-79EF-80DF0F0C0B21}"/>
-                              </a:ext>
-                            </a:extLst>
-                          </pic:cNvPr>
-                          <pic:cNvPicPr>
-                            <a:picLocks noChangeAspect="1" noChangeArrowheads="1"/>
-                          </pic:cNvPicPr>
-                        </pic:nvPicPr>
-                        <pic:blipFill rotWithShape="1">
-                          <a:blip r:embed="rId13" cstate="print">
-                            <a:extLst>
-                              <a:ext uri="{28A0092B-C50C-407E-A947-70E740481C1C}">
-                                <a14:useLocalDpi xmlns:a14="http://schemas.microsoft.com/office/drawing/2010/main" val="0"/>
-                              </a:ext>
-                            </a:extLst>
-                          </a:blip>
-                          <a:srcRect r="23404" b="12203"/>
-                          <a:stretch/>
-                        </pic:blipFill>
-                        <pic:spPr bwMode="auto">
-                          <a:xfrm>
-                            <a:off x="0" y="0"/>
-                            <a:ext cx="1674000" cy="1080000"/>
-                          </a:xfrm>
-                          <a:prstGeom prst="rect">
-                            <a:avLst/>
-                          </a:prstGeom>
-                          <a:noFill/>
-                          <a:ln>
-                            <a:noFill/>
-                          </a:ln>
-                          <a:extLst>
-                            <a:ext uri="{53640926-AAD7-44D8-BBD7-CCE9431645EC}">
-                              <a14:shadowObscured xmlns:a14="http://schemas.microsoft.com/office/drawing/2010/main"/>
-                            </a:ext>
-                          </a:extLst>
-                        </pic:spPr>
-                      </pic:pic>
-                    </a:graphicData>
-                  </a:graphic>
-                </wp:inline>
-              </w:drawing>
-            </w:r>
-          </w:p>
-        </w:tc>
-        <w:tc>
-          <w:tcPr>
-            <w:tcW w:w="0" w:type="auto"/>
-            <w:vAlign w:val="center"/>
-          </w:tcPr>
-          <w:p>
-            <w:pPr>
-              <w:pStyle w:val="a6"/>
-              <w:spacing w:line="276" w:lineRule="auto"/>
-              <w:ind w:left="0"/>
-              <w:jc w:val="center"/>
-              <w:rPr>
-                <w:sz w:val="20"/>
-                <w:szCs w:val="21"/>
-              </w:rPr>
-            </w:pPr>
-            <w:r>
-              <w:rPr>
-                <w:noProof/>
-              </w:rPr>
-              <w:drawing>
-                <wp:inline distT="0" distB="0" distL="0" distR="0" wp14:anchorId="160AE6BF" wp14:editId="3B42DF37">
-                  <wp:extent cx="1944000" cy="1080000"/>
-                  <wp:effectExtent l="0" t="0" r="0" b="0"/>
-                  <wp:docPr id="4" name="Picture 2" descr="잇써보니:넥슨 '블루아카이브'] 디테일한 스토리 라인·몰입도 높은 캐릭터...'덕후 될라' | 서울경제">
-                    <a:extLst xmlns:a="http://schemas.openxmlformats.org/drawingml/2006/main">
-                      <a:ext uri="{FF2B5EF4-FFF2-40B4-BE49-F238E27FC236}">
-                        <a16:creationId xmlns:a16="http://schemas.microsoft.com/office/drawing/2014/main" id="{01200305-41EC-7BB6-D179-E4B073FA2792}"/>
-                      </a:ext>
-                    </a:extLst>
-                  </wp:docPr>
-                  <wp:cNvGraphicFramePr>
-                    <a:graphicFrameLocks xmlns:a="http://schemas.openxmlformats.org/drawingml/2006/main" noChangeAspect="1"/>
-                  </wp:cNvGraphicFramePr>
-                  <a:graphic xmlns:a="http://schemas.openxmlformats.org/drawingml/2006/main">
-                    <a:graphicData uri="http://schemas.openxmlformats.org/drawingml/2006/picture">
-                      <pic:pic xmlns:pic="http://schemas.openxmlformats.org/drawingml/2006/picture">
-                        <pic:nvPicPr>
-                          <pic:cNvPr id="4" name="Picture 2" descr="잇써보니:넥슨 '블루아카이브'] 디테일한 스토리 라인·몰입도 높은 캐릭터...'덕후 될라' | 서울경제">
-                            <a:extLst>
-                              <a:ext uri="{FF2B5EF4-FFF2-40B4-BE49-F238E27FC236}">
-                                <a16:creationId xmlns:a16="http://schemas.microsoft.com/office/drawing/2014/main" id="{01200305-41EC-7BB6-D179-E4B073FA2792}"/>
-                              </a:ext>
-                            </a:extLst>
-                          </pic:cNvPr>
-                          <pic:cNvPicPr>
-                            <a:picLocks noChangeAspect="1" noChangeArrowheads="1"/>
-                          </pic:cNvPicPr>
-                        </pic:nvPicPr>
-                        <pic:blipFill rotWithShape="1">
-                          <a:blip r:embed="rId14">
-                            <a:extLst>
-                              <a:ext uri="{28A0092B-C50C-407E-A947-70E740481C1C}">
-                                <a14:useLocalDpi xmlns:a14="http://schemas.microsoft.com/office/drawing/2010/main" val="0"/>
-                              </a:ext>
-                            </a:extLst>
-                          </a:blip>
-                          <a:srcRect l="18882" r="18546" b="28398"/>
-                          <a:stretch/>
-                        </pic:blipFill>
-                        <pic:spPr bwMode="auto">
-                          <a:xfrm>
-                            <a:off x="0" y="0"/>
-                            <a:ext cx="1944000" cy="1080000"/>
-                          </a:xfrm>
-                          <a:prstGeom prst="rect">
-                            <a:avLst/>
-                          </a:prstGeom>
-                          <a:noFill/>
-                          <a:ln>
-                            <a:noFill/>
-                          </a:ln>
-                          <a:extLst>
-                            <a:ext uri="{53640926-AAD7-44D8-BBD7-CCE9431645EC}">
-                              <a14:shadowObscured xmlns:a14="http://schemas.microsoft.com/office/drawing/2010/main"/>
-                            </a:ext>
-                          </a:extLst>
-                        </pic:spPr>
-                      </pic:pic>
-                    </a:graphicData>
-                  </a:graphic>
-                </wp:inline>
-              </w:drawing>
-            </w:r>
-          </w:p>
-        </w:tc>
-      </w:tr>
-    </w:tbl>
-    <w:p>
-      <w:pPr>
+          <w:szCs w:val="20"/>
+        </w:rPr>
+        <w:t>각 학생들</w:t>
+      </w:r>
+      <w:r>
+        <w:rPr>
+          <w:rFonts w:hint="eastAsia"/>
+          <w:sz w:val="20"/>
+          <w:szCs w:val="20"/>
+        </w:rPr>
+        <w:t xml:space="preserve">은 </w:t>
+      </w:r>
+      <w:r>
+        <w:rPr>
+          <w:rFonts w:hint="eastAsia"/>
+          <w:sz w:val="20"/>
+          <w:szCs w:val="20"/>
+        </w:rPr>
+        <w:t xml:space="preserve">개성 넘치는 </w:t>
+      </w:r>
+      <w:r>
+        <w:rPr>
+          <w:rFonts w:hint="eastAsia"/>
+          <w:sz w:val="20"/>
+          <w:szCs w:val="20"/>
+        </w:rPr>
+        <w:t>고유 스킬을 가</w:t>
+      </w:r>
+      <w:r>
+        <w:rPr>
+          <w:rFonts w:hint="eastAsia"/>
+          <w:sz w:val="20"/>
+          <w:szCs w:val="20"/>
+        </w:rPr>
+        <w:t>짐</w:t>
+      </w:r>
+    </w:p>
+    <w:p>
+      <w:pPr>
+        <w:pStyle w:val="a6"/>
+        <w:spacing w:line="276" w:lineRule="auto"/>
+        <w:ind w:left="1160"/>
+        <w:jc w:val="both"/>
+        <w:rPr>
+          <w:sz w:val="20"/>
+          <w:szCs w:val="20"/>
+        </w:rPr>
+      </w:pPr>
+    </w:p>
+    <w:p>
+      <w:pPr>
+        <w:pStyle w:val="a6"/>
+        <w:spacing w:line="276" w:lineRule="auto"/>
+        <w:ind w:left="1160"/>
+        <w:jc w:val="both"/>
+        <w:rPr>
+          <w:sz w:val="20"/>
+          <w:szCs w:val="20"/>
+        </w:rPr>
+      </w:pPr>
+      <w:r>
+        <w:rPr>
+          <w:sz w:val="20"/>
+          <w:szCs w:val="20"/>
+        </w:rPr>
+        <w:t xml:space="preserve">EX </w:t>
+      </w:r>
+      <w:r>
+        <w:rPr>
+          <w:rFonts w:hint="eastAsia"/>
+          <w:sz w:val="20"/>
+          <w:szCs w:val="20"/>
+        </w:rPr>
+        <w:t>스킬</w:t>
+      </w:r>
+    </w:p>
+    <w:p>
+      <w:pPr>
+        <w:pStyle w:val="a6"/>
+        <w:numPr>
+          <w:ilvl w:val="0"/>
+          <w:numId w:val="16"/>
+        </w:numPr>
         <w:spacing w:line="276" w:lineRule="auto"/>
         <w:jc w:val="both"/>
         <w:rPr>
           <w:sz w:val="20"/>
-          <w:szCs w:val="21"/>
+          <w:szCs w:val="20"/>
+        </w:rPr>
+      </w:pPr>
+      <w:r>
+        <w:rPr>
+          <w:rFonts w:hint="eastAsia"/>
+          <w:sz w:val="20"/>
+          <w:szCs w:val="20"/>
+        </w:rPr>
+        <w:t>일정 시간마다 플레이어가 사용 가능</w:t>
+      </w:r>
+    </w:p>
+    <w:p>
+      <w:pPr>
+        <w:pStyle w:val="a6"/>
+        <w:numPr>
+          <w:ilvl w:val="0"/>
+          <w:numId w:val="16"/>
+        </w:numPr>
+        <w:spacing w:line="276" w:lineRule="auto"/>
+        <w:jc w:val="both"/>
+        <w:rPr>
+          <w:sz w:val="20"/>
+          <w:szCs w:val="20"/>
+        </w:rPr>
+      </w:pPr>
+      <w:r>
+        <w:rPr>
+          <w:rFonts w:hint="eastAsia"/>
+          <w:sz w:val="20"/>
+          <w:szCs w:val="20"/>
+        </w:rPr>
+        <w:t>사용 중</w:t>
+      </w:r>
+      <w:r>
+        <w:rPr>
+          <w:rFonts w:hint="eastAsia"/>
+          <w:sz w:val="20"/>
+          <w:szCs w:val="20"/>
+        </w:rPr>
+        <w:t xml:space="preserve"> 받는 데미지가 90% 감소</w:t>
+      </w:r>
+    </w:p>
+    <w:p>
+      <w:pPr>
+        <w:pStyle w:val="a6"/>
+        <w:spacing w:line="276" w:lineRule="auto"/>
+        <w:ind w:left="1160"/>
+        <w:jc w:val="both"/>
+        <w:rPr>
+          <w:sz w:val="20"/>
+          <w:szCs w:val="20"/>
+        </w:rPr>
+      </w:pPr>
+    </w:p>
+    <w:p>
+      <w:pPr>
+        <w:pStyle w:val="a6"/>
+        <w:spacing w:line="276" w:lineRule="auto"/>
+        <w:ind w:left="1160"/>
+        <w:jc w:val="both"/>
+        <w:rPr>
+          <w:sz w:val="20"/>
+          <w:szCs w:val="20"/>
+        </w:rPr>
+      </w:pPr>
+      <w:r>
+        <w:rPr>
+          <w:rFonts w:hint="eastAsia"/>
+          <w:sz w:val="20"/>
+          <w:szCs w:val="20"/>
+        </w:rPr>
+        <w:t>기본 스킬</w:t>
+      </w:r>
+    </w:p>
+    <w:p>
+      <w:pPr>
+        <w:pStyle w:val="a6"/>
+        <w:numPr>
+          <w:ilvl w:val="0"/>
+          <w:numId w:val="17"/>
+        </w:numPr>
+        <w:spacing w:line="276" w:lineRule="auto"/>
+        <w:jc w:val="both"/>
+        <w:rPr>
+          <w:sz w:val="20"/>
+          <w:szCs w:val="20"/>
+        </w:rPr>
+      </w:pPr>
+      <w:r>
+        <w:rPr>
+          <w:rFonts w:hint="eastAsia"/>
+          <w:sz w:val="20"/>
+          <w:szCs w:val="20"/>
+        </w:rPr>
+        <w:t xml:space="preserve">일정 시간마다 </w:t>
+      </w:r>
+      <w:r>
+        <w:rPr>
+          <w:rFonts w:hint="eastAsia"/>
+          <w:sz w:val="20"/>
+          <w:szCs w:val="20"/>
+        </w:rPr>
+        <w:t>플레이어가 사</w:t>
+      </w:r>
+      <w:r>
+        <w:rPr>
+          <w:rFonts w:hint="eastAsia"/>
+          <w:sz w:val="20"/>
+          <w:szCs w:val="20"/>
+        </w:rPr>
+        <w:t>용할 수 있거나</w:t>
+      </w:r>
+      <w:r>
+        <w:rPr>
+          <w:rFonts w:hint="eastAsia"/>
+          <w:sz w:val="20"/>
+          <w:szCs w:val="20"/>
+        </w:rPr>
+        <w:t>, 효과가 상시 적용</w:t>
+      </w:r>
+    </w:p>
+    <w:p>
+      <w:pPr>
+        <w:spacing w:line="276" w:lineRule="auto"/>
+        <w:jc w:val="both"/>
+        <w:rPr>
+          <w:sz w:val="20"/>
+          <w:szCs w:val="20"/>
+        </w:rPr>
+      </w:pPr>
+    </w:p>
+    <w:p>
+      <w:pPr>
+        <w:spacing w:line="276" w:lineRule="auto"/>
+        <w:jc w:val="both"/>
+        <w:rPr>
+          <w:sz w:val="20"/>
+          <w:szCs w:val="20"/>
+        </w:rPr>
+      </w:pPr>
+    </w:p>
+    <w:p>
+      <w:pPr>
+        <w:spacing w:line="276" w:lineRule="auto"/>
+        <w:jc w:val="both"/>
+        <w:rPr>
+          <w:sz w:val="20"/>
+          <w:szCs w:val="20"/>
         </w:rPr>
       </w:pPr>
     </w:p>
@@ -3375,472 +2593,11 @@
         <w:pStyle w:val="a6"/>
         <w:numPr>
           <w:ilvl w:val="2"/>
-          <w:numId w:val="21"/>
+          <w:numId w:val="15"/>
         </w:numPr>
         <w:spacing w:line="276" w:lineRule="auto"/>
         <w:jc w:val="both"/>
-        <w:rPr>
-          <w:sz w:val="20"/>
-          <w:szCs w:val="20"/>
-        </w:rPr>
-      </w:pPr>
-    </w:p>
-    <w:p>
-      <w:pPr>
-        <w:spacing w:line="276" w:lineRule="auto"/>
-        <w:jc w:val="both"/>
-        <w:rPr>
-          <w:sz w:val="20"/>
-          <w:szCs w:val="20"/>
-        </w:rPr>
-      </w:pPr>
-    </w:p>
-    <w:p>
-      <w:pPr>
-        <w:pStyle w:val="a6"/>
-        <w:numPr>
-          <w:ilvl w:val="0"/>
-          <w:numId w:val="21"/>
-        </w:numPr>
-        <w:spacing w:line="276" w:lineRule="auto"/>
-        <w:jc w:val="both"/>
-        <w:outlineLvl w:val="1"/>
-        <w:rPr>
-          <w:b/>
-          <w:bCs/>
-          <w:szCs w:val="22"/>
-        </w:rPr>
-      </w:pPr>
-      <w:bookmarkStart w:id="6" w:name="_Toc178151260"/>
-      <w:r>
-        <w:rPr>
-          <w:rFonts w:hint="eastAsia"/>
-          <w:b/>
-          <w:bCs/>
-          <w:szCs w:val="22"/>
-        </w:rPr>
-        <w:t>캐릭터</w:t>
-      </w:r>
-      <w:bookmarkEnd w:id="6"/>
-    </w:p>
-    <w:p>
-      <w:pPr>
-        <w:pStyle w:val="a6"/>
-        <w:spacing w:line="276" w:lineRule="auto"/>
-        <w:ind w:left="580"/>
-        <w:jc w:val="both"/>
-        <w:rPr>
-          <w:sz w:val="20"/>
-          <w:szCs w:val="20"/>
-        </w:rPr>
-      </w:pPr>
-      <w:r>
-        <w:rPr>
-          <w:sz w:val="20"/>
-          <w:szCs w:val="20"/>
-        </w:rPr>
-        <w:t>“Blue Archive”</w:t>
-      </w:r>
-      <w:proofErr w:type="spellStart"/>
-      <w:r>
-        <w:rPr>
-          <w:rFonts w:hint="eastAsia"/>
-          <w:sz w:val="20"/>
-          <w:szCs w:val="20"/>
-        </w:rPr>
-        <w:t>에</w:t>
-      </w:r>
-      <w:proofErr w:type="spellEnd"/>
-      <w:r>
-        <w:rPr>
-          <w:rFonts w:hint="eastAsia"/>
-          <w:sz w:val="20"/>
-          <w:szCs w:val="20"/>
-        </w:rPr>
-        <w:t xml:space="preserve"> 등장하는 </w:t>
-      </w:r>
-      <w:r>
-        <w:rPr>
-          <w:rFonts w:hint="eastAsia"/>
-          <w:sz w:val="20"/>
-          <w:szCs w:val="20"/>
-        </w:rPr>
-        <w:t xml:space="preserve">학생들 중 최소 </w:t>
-      </w:r>
-      <w:r>
-        <w:rPr>
-          <w:rFonts w:hint="eastAsia"/>
-          <w:sz w:val="20"/>
-          <w:szCs w:val="20"/>
-        </w:rPr>
-        <w:t>5</w:t>
-      </w:r>
-      <w:r>
-        <w:rPr>
-          <w:rFonts w:hint="eastAsia"/>
-          <w:sz w:val="20"/>
-          <w:szCs w:val="20"/>
-        </w:rPr>
-        <w:t xml:space="preserve">명 </w:t>
-      </w:r>
-      <w:r>
-        <w:rPr>
-          <w:rFonts w:hint="eastAsia"/>
-          <w:sz w:val="20"/>
-          <w:szCs w:val="20"/>
-        </w:rPr>
-        <w:t>이상 구현</w:t>
-      </w:r>
-    </w:p>
-    <w:p>
-      <w:pPr>
-        <w:pStyle w:val="a6"/>
-        <w:spacing w:line="276" w:lineRule="auto"/>
-        <w:ind w:left="580"/>
-        <w:jc w:val="both"/>
-        <w:rPr>
-          <w:sz w:val="20"/>
-          <w:szCs w:val="20"/>
-        </w:rPr>
-      </w:pPr>
-    </w:p>
-    <w:p>
-      <w:pPr>
-        <w:pStyle w:val="a6"/>
-        <w:numPr>
-          <w:ilvl w:val="1"/>
-          <w:numId w:val="21"/>
-        </w:numPr>
-        <w:spacing w:line="276" w:lineRule="auto"/>
-        <w:jc w:val="both"/>
-        <w:rPr>
-          <w:b/>
-          <w:bCs/>
-          <w:sz w:val="20"/>
-          <w:szCs w:val="20"/>
-        </w:rPr>
-      </w:pPr>
-      <w:r>
-        <w:rPr>
-          <w:rFonts w:hint="eastAsia"/>
-          <w:b/>
-          <w:bCs/>
-          <w:sz w:val="20"/>
-          <w:szCs w:val="20"/>
-        </w:rPr>
-        <w:t xml:space="preserve"> </w:t>
-      </w:r>
-      <w:r>
-        <w:rPr>
-          <w:rFonts w:hint="eastAsia"/>
-          <w:b/>
-          <w:bCs/>
-          <w:sz w:val="20"/>
-          <w:szCs w:val="20"/>
-        </w:rPr>
-        <w:t>스킬</w:t>
-      </w:r>
-    </w:p>
-    <w:p>
-      <w:pPr>
-        <w:pStyle w:val="a6"/>
-        <w:spacing w:line="276" w:lineRule="auto"/>
-        <w:ind w:left="800"/>
-        <w:jc w:val="both"/>
-        <w:rPr>
-          <w:sz w:val="20"/>
-          <w:szCs w:val="20"/>
-        </w:rPr>
-      </w:pPr>
-      <w:r>
-        <w:rPr>
-          <w:rFonts w:hint="eastAsia"/>
-          <w:sz w:val="20"/>
-          <w:szCs w:val="20"/>
-        </w:rPr>
-        <w:t>각 학생들</w:t>
-      </w:r>
-      <w:r>
-        <w:rPr>
-          <w:rFonts w:hint="eastAsia"/>
-          <w:sz w:val="20"/>
-          <w:szCs w:val="20"/>
-        </w:rPr>
-        <w:t xml:space="preserve">은 </w:t>
-      </w:r>
-      <w:r>
-        <w:rPr>
-          <w:rFonts w:hint="eastAsia"/>
-          <w:sz w:val="20"/>
-          <w:szCs w:val="20"/>
-        </w:rPr>
-        <w:t xml:space="preserve">개성 넘치는 </w:t>
-      </w:r>
-      <w:r>
-        <w:rPr>
-          <w:rFonts w:hint="eastAsia"/>
-          <w:sz w:val="20"/>
-          <w:szCs w:val="20"/>
-        </w:rPr>
-        <w:t>고유 스킬을 가</w:t>
-      </w:r>
-      <w:r>
-        <w:rPr>
-          <w:rFonts w:hint="eastAsia"/>
-          <w:sz w:val="20"/>
-          <w:szCs w:val="20"/>
-        </w:rPr>
-        <w:t>짐</w:t>
-      </w:r>
-    </w:p>
-    <w:p>
-      <w:pPr>
-        <w:pStyle w:val="a6"/>
-        <w:spacing w:line="276" w:lineRule="auto"/>
-        <w:ind w:left="800"/>
-        <w:jc w:val="both"/>
-        <w:rPr>
-          <w:sz w:val="20"/>
-          <w:szCs w:val="20"/>
-        </w:rPr>
-      </w:pPr>
-    </w:p>
-    <w:p>
-      <w:pPr>
-        <w:pStyle w:val="a6"/>
-        <w:numPr>
-          <w:ilvl w:val="2"/>
-          <w:numId w:val="21"/>
-        </w:numPr>
-        <w:spacing w:line="276" w:lineRule="auto"/>
-        <w:jc w:val="both"/>
-        <w:rPr>
-          <w:b/>
-          <w:bCs/>
-          <w:sz w:val="20"/>
-          <w:szCs w:val="20"/>
-        </w:rPr>
-      </w:pPr>
-      <w:r>
-        <w:rPr>
-          <w:b/>
-          <w:bCs/>
-          <w:sz w:val="20"/>
-          <w:szCs w:val="20"/>
-        </w:rPr>
-        <w:t xml:space="preserve">EX </w:t>
-      </w:r>
-      <w:r>
-        <w:rPr>
-          <w:rFonts w:hint="eastAsia"/>
-          <w:b/>
-          <w:bCs/>
-          <w:sz w:val="20"/>
-          <w:szCs w:val="20"/>
-        </w:rPr>
-        <w:t>스킬</w:t>
-      </w:r>
-    </w:p>
-    <w:p>
-      <w:pPr>
-        <w:pStyle w:val="a6"/>
-        <w:numPr>
-          <w:ilvl w:val="0"/>
-          <w:numId w:val="19"/>
-        </w:numPr>
-        <w:spacing w:line="276" w:lineRule="auto"/>
-        <w:jc w:val="both"/>
-        <w:rPr>
-          <w:b/>
-          <w:bCs/>
-          <w:sz w:val="20"/>
-          <w:szCs w:val="20"/>
-        </w:rPr>
-      </w:pPr>
-      <w:r>
-        <w:rPr>
-          <w:rFonts w:hint="eastAsia"/>
-          <w:sz w:val="20"/>
-          <w:szCs w:val="20"/>
-        </w:rPr>
-        <w:t>일정 시간마다 플레이어가 사용 가능</w:t>
-      </w:r>
-    </w:p>
-    <w:p>
-      <w:pPr>
-        <w:pStyle w:val="a6"/>
-        <w:numPr>
-          <w:ilvl w:val="0"/>
-          <w:numId w:val="19"/>
-        </w:numPr>
-        <w:spacing w:line="276" w:lineRule="auto"/>
-        <w:jc w:val="both"/>
-        <w:rPr>
-          <w:sz w:val="20"/>
-          <w:szCs w:val="20"/>
-        </w:rPr>
-      </w:pPr>
-      <w:r>
-        <w:rPr>
-          <w:rFonts w:hint="eastAsia"/>
-          <w:sz w:val="20"/>
-          <w:szCs w:val="20"/>
-        </w:rPr>
-        <w:t>사용 중</w:t>
-      </w:r>
-      <w:r>
-        <w:rPr>
-          <w:rFonts w:hint="eastAsia"/>
-          <w:sz w:val="20"/>
-          <w:szCs w:val="20"/>
-        </w:rPr>
-        <w:t xml:space="preserve"> 받는 데미지가 90% 감소</w:t>
-      </w:r>
-    </w:p>
-    <w:p>
-      <w:pPr>
-        <w:pStyle w:val="a6"/>
-        <w:spacing w:line="276" w:lineRule="auto"/>
-        <w:ind w:left="2040"/>
-        <w:jc w:val="both"/>
-        <w:rPr>
-          <w:sz w:val="20"/>
-          <w:szCs w:val="20"/>
-        </w:rPr>
-      </w:pPr>
-    </w:p>
-    <w:p>
-      <w:pPr>
-        <w:pStyle w:val="a6"/>
-        <w:numPr>
-          <w:ilvl w:val="2"/>
-          <w:numId w:val="21"/>
-        </w:numPr>
-        <w:spacing w:line="276" w:lineRule="auto"/>
-        <w:jc w:val="both"/>
-        <w:rPr>
-          <w:b/>
-          <w:bCs/>
-          <w:sz w:val="20"/>
-          <w:szCs w:val="20"/>
-        </w:rPr>
-      </w:pPr>
-      <w:r>
-        <w:rPr>
-          <w:rFonts w:hint="eastAsia"/>
-          <w:b/>
-          <w:bCs/>
-          <w:sz w:val="20"/>
-          <w:szCs w:val="20"/>
-        </w:rPr>
-        <w:t>기본 스킬</w:t>
-      </w:r>
-    </w:p>
-    <w:p>
-      <w:pPr>
-        <w:pStyle w:val="a6"/>
-        <w:numPr>
-          <w:ilvl w:val="0"/>
-          <w:numId w:val="23"/>
-        </w:numPr>
-        <w:spacing w:line="276" w:lineRule="auto"/>
-        <w:jc w:val="both"/>
-        <w:rPr>
-          <w:sz w:val="20"/>
-          <w:szCs w:val="20"/>
-        </w:rPr>
-      </w:pPr>
-      <w:r>
-        <w:rPr>
-          <w:rFonts w:hint="eastAsia"/>
-          <w:sz w:val="20"/>
-          <w:szCs w:val="20"/>
-        </w:rPr>
-        <w:t xml:space="preserve">일정 시간마다 </w:t>
-      </w:r>
-      <w:r>
-        <w:rPr>
-          <w:rFonts w:hint="eastAsia"/>
-          <w:sz w:val="20"/>
-          <w:szCs w:val="20"/>
-        </w:rPr>
-        <w:t>플레이어가 사</w:t>
-      </w:r>
-      <w:r>
-        <w:rPr>
-          <w:rFonts w:hint="eastAsia"/>
-          <w:sz w:val="20"/>
-          <w:szCs w:val="20"/>
-        </w:rPr>
-        <w:t>용할 수 있거나</w:t>
-      </w:r>
-      <w:r>
-        <w:rPr>
-          <w:rFonts w:hint="eastAsia"/>
-          <w:sz w:val="20"/>
-          <w:szCs w:val="20"/>
-        </w:rPr>
-        <w:t>, 효과가 상시 적용</w:t>
-      </w:r>
-    </w:p>
-    <w:p>
-      <w:pPr>
-        <w:spacing w:line="276" w:lineRule="auto"/>
-        <w:jc w:val="both"/>
-        <w:rPr>
-          <w:sz w:val="20"/>
-          <w:szCs w:val="20"/>
-        </w:rPr>
-      </w:pPr>
-    </w:p>
-    <w:p>
-      <w:pPr>
-        <w:spacing w:line="276" w:lineRule="auto"/>
-        <w:jc w:val="both"/>
-        <w:rPr>
-          <w:sz w:val="20"/>
-          <w:szCs w:val="20"/>
-        </w:rPr>
-      </w:pPr>
-    </w:p>
-    <w:p>
-      <w:pPr>
-        <w:spacing w:line="276" w:lineRule="auto"/>
-        <w:jc w:val="both"/>
-        <w:rPr>
-          <w:sz w:val="20"/>
-          <w:szCs w:val="20"/>
-        </w:rPr>
-      </w:pPr>
-    </w:p>
-    <w:p>
-      <w:pPr>
-        <w:widowControl/>
-        <w:wordWrap/>
-        <w:autoSpaceDE/>
-        <w:autoSpaceDN/>
-        <w:rPr>
-          <w:sz w:val="20"/>
-          <w:szCs w:val="20"/>
-        </w:rPr>
-      </w:pPr>
-      <w:r>
-        <w:rPr>
-          <w:sz w:val="20"/>
-          <w:szCs w:val="20"/>
-        </w:rPr>
-        <w:br w:type="page"/>
-      </w:r>
-    </w:p>
-    <w:p>
-      <w:pPr>
-        <w:pStyle w:val="a6"/>
-        <w:numPr>
-          <w:ilvl w:val="2"/>
-          <w:numId w:val="21"/>
-        </w:numPr>
-        <w:spacing w:line="276" w:lineRule="auto"/>
-        <w:jc w:val="both"/>
+        <w:outlineLvl w:val="2"/>
         <w:rPr>
           <w:b/>
           <w:bCs/>
@@ -3991,7 +2748,7 @@
                           </pic:cNvPicPr>
                         </pic:nvPicPr>
                         <pic:blipFill>
-                          <a:blip r:embed="rId15" cstate="print">
+                          <a:blip r:embed="rId11" cstate="print">
                             <a:extLst>
                               <a:ext uri="{28A0092B-C50C-407E-A947-70E740481C1C}">
                                 <a14:useLocalDpi xmlns:a14="http://schemas.microsoft.com/office/drawing/2010/main" val="0"/>
@@ -4879,7 +3636,7 @@
                           </pic:cNvPicPr>
                         </pic:nvPicPr>
                         <pic:blipFill>
-                          <a:blip r:embed="rId16">
+                          <a:blip r:embed="rId12">
                             <a:extLst>
                               <a:ext uri="{28A0092B-C50C-407E-A947-70E740481C1C}">
                                 <a14:useLocalDpi xmlns:a14="http://schemas.microsoft.com/office/drawing/2010/main" val="0"/>
@@ -5035,7 +3792,7 @@
                           </pic:cNvPicPr>
                         </pic:nvPicPr>
                         <pic:blipFill>
-                          <a:blip r:embed="rId17" cstate="print">
+                          <a:blip r:embed="rId13" cstate="print">
                             <a:extLst>
                               <a:ext uri="{28A0092B-C50C-407E-A947-70E740481C1C}">
                                 <a14:useLocalDpi xmlns:a14="http://schemas.microsoft.com/office/drawing/2010/main" val="0"/>
@@ -5120,7 +3877,7 @@
                           </pic:cNvPicPr>
                         </pic:nvPicPr>
                         <pic:blipFill>
-                          <a:blip r:embed="rId18" cstate="print">
+                          <a:blip r:embed="rId14" cstate="print">
                             <a:extLst>
                               <a:ext uri="{28A0092B-C50C-407E-A947-70E740481C1C}">
                                 <a14:useLocalDpi xmlns:a14="http://schemas.microsoft.com/office/drawing/2010/main" val="0"/>
@@ -5420,6 +4177,7 @@
           <w:szCs w:val="48"/>
         </w:rPr>
       </w:pPr>
+      <w:bookmarkStart w:id="1" w:name="_Toc176470546"/>
       <w:r>
         <w:rPr>
           <w:rFonts w:hint="eastAsia"/>
@@ -5431,7 +4189,6 @@
         <w:lastRenderedPageBreak/>
         <w:t xml:space="preserve"> </w:t>
       </w:r>
-      <w:bookmarkStart w:id="7" w:name="_Toc178151261"/>
       <w:r>
         <w:rPr>
           <w:rFonts w:hint="eastAsia"/>
@@ -5442,7 +4199,7 @@
         </w:rPr>
         <w:t>개발 환경</w:t>
       </w:r>
-      <w:bookmarkEnd w:id="7"/>
+      <w:bookmarkEnd w:id="1"/>
     </w:p>
     <w:tbl>
       <w:tblPr>
@@ -5478,57 +4235,6 @@
                 <w:bCs/>
                 <w:szCs w:val="22"/>
               </w:rPr>
-              <w:t>운영체제</w:t>
-            </w:r>
-          </w:p>
-        </w:tc>
-        <w:tc>
-          <w:tcPr>
-            <w:tcW w:w="6611" w:type="dxa"/>
-            <w:vAlign w:val="center"/>
-          </w:tcPr>
-          <w:p>
-            <w:pPr>
-              <w:spacing w:line="276" w:lineRule="auto"/>
-              <w:jc w:val="center"/>
-              <w:rPr>
-                <w:sz w:val="20"/>
-                <w:szCs w:val="20"/>
-              </w:rPr>
-            </w:pPr>
-            <w:r>
-              <w:rPr>
-                <w:sz w:val="20"/>
-                <w:szCs w:val="20"/>
-              </w:rPr>
-              <w:t>Windows, macOS</w:t>
-            </w:r>
-          </w:p>
-        </w:tc>
-      </w:tr>
-      <w:tr>
-        <w:tc>
-          <w:tcPr>
-            <w:tcW w:w="2405" w:type="dxa"/>
-            <w:vAlign w:val="center"/>
-          </w:tcPr>
-          <w:p>
-            <w:pPr>
-              <w:spacing w:line="276" w:lineRule="auto"/>
-              <w:jc w:val="center"/>
-              <w:rPr>
-                <w:b/>
-                <w:bCs/>
-                <w:szCs w:val="22"/>
-              </w:rPr>
-            </w:pPr>
-            <w:r>
-              <w:rPr>
-                <w:rFonts w:hint="eastAsia"/>
-                <w:b/>
-                <w:bCs/>
-                <w:szCs w:val="22"/>
-              </w:rPr>
               <w:t>개발 언어</w:t>
             </w:r>
           </w:p>
@@ -5840,16 +4546,42 @@
     </w:p>
     <w:p>
       <w:pPr>
+        <w:spacing w:line="276" w:lineRule="auto"/>
+        <w:jc w:val="both"/>
+        <w:rPr>
+          <w:sz w:val="20"/>
+          <w:szCs w:val="20"/>
+        </w:rPr>
+      </w:pPr>
+    </w:p>
+    <w:p>
+      <w:pPr>
+        <w:spacing w:line="276" w:lineRule="auto"/>
+        <w:jc w:val="both"/>
+        <w:rPr>
+          <w:sz w:val="20"/>
+          <w:szCs w:val="20"/>
+        </w:rPr>
+      </w:pPr>
+    </w:p>
+    <w:p>
+      <w:pPr>
         <w:widowControl/>
         <w:wordWrap/>
         <w:autoSpaceDE/>
         <w:autoSpaceDN/>
-        <w:jc w:val="both"/>
-        <w:rPr>
-          <w:sz w:val="20"/>
-          <w:szCs w:val="20"/>
-        </w:rPr>
-      </w:pPr>
+        <w:rPr>
+          <w:sz w:val="20"/>
+          <w:szCs w:val="20"/>
+        </w:rPr>
+      </w:pPr>
+      <w:r>
+        <w:rPr>
+          <w:sz w:val="20"/>
+          <w:szCs w:val="20"/>
+        </w:rPr>
+        <w:br w:type="page"/>
+      </w:r>
     </w:p>
     <w:p>
       <w:pPr>
@@ -5861,6 +4593,7 @@
           <w:szCs w:val="48"/>
         </w:rPr>
       </w:pPr>
+      <w:bookmarkStart w:id="2" w:name="_Toc176470547"/>
       <w:r>
         <w:rPr>
           <w:rFonts w:hint="eastAsia"/>
@@ -5869,9 +4602,9 @@
           <w:sz w:val="48"/>
           <w:szCs w:val="48"/>
         </w:rPr>
+        <w:lastRenderedPageBreak/>
         <w:t xml:space="preserve"> </w:t>
       </w:r>
-      <w:bookmarkStart w:id="8" w:name="_Toc178151262"/>
       <w:r>
         <w:rPr>
           <w:rFonts w:hint="eastAsia"/>
@@ -5882,6 +4615,68 @@
         </w:rPr>
         <w:t>연구 목적</w:t>
       </w:r>
+      <w:bookmarkEnd w:id="2"/>
+    </w:p>
+    <w:p>
+      <w:pPr>
+        <w:spacing w:line="276" w:lineRule="auto"/>
+        <w:jc w:val="both"/>
+        <w:rPr>
+          <w:sz w:val="20"/>
+          <w:szCs w:val="20"/>
+        </w:rPr>
+      </w:pPr>
+    </w:p>
+    <w:p>
+      <w:pPr>
+        <w:spacing w:line="276" w:lineRule="auto"/>
+        <w:jc w:val="both"/>
+        <w:rPr>
+          <w:sz w:val="20"/>
+          <w:szCs w:val="20"/>
+        </w:rPr>
+      </w:pPr>
+    </w:p>
+    <w:p>
+      <w:pPr>
+        <w:spacing w:line="276" w:lineRule="auto"/>
+        <w:jc w:val="both"/>
+        <w:rPr>
+          <w:sz w:val="20"/>
+          <w:szCs w:val="20"/>
+        </w:rPr>
+      </w:pPr>
+    </w:p>
+    <w:p>
+      <w:pPr>
+        <w:widowControl/>
+        <w:wordWrap/>
+        <w:autoSpaceDE/>
+        <w:autoSpaceDN/>
+        <w:rPr>
+          <w:sz w:val="20"/>
+          <w:szCs w:val="20"/>
+        </w:rPr>
+      </w:pPr>
+      <w:r>
+        <w:rPr>
+          <w:sz w:val="20"/>
+          <w:szCs w:val="20"/>
+        </w:rPr>
+        <w:br w:type="page"/>
+      </w:r>
+    </w:p>
+    <w:p>
+      <w:pPr>
+        <w:pStyle w:val="1"/>
+        <w:rPr>
+          <w:b/>
+          <w:bCs/>
+          <w:sz w:val="48"/>
+          <w:szCs w:val="48"/>
+        </w:rPr>
+      </w:pPr>
+      <w:bookmarkStart w:id="3" w:name="_Toc176470548"/>
       <w:r>
         <w:rPr>
           <w:rFonts w:hint="eastAsia"/>
@@ -5890,537 +4685,9 @@
           <w:sz w:val="48"/>
           <w:szCs w:val="48"/>
         </w:rPr>
-        <w:t xml:space="preserve"> 및 중점 연구 분야</w:t>
-      </w:r>
-      <w:bookmarkEnd w:id="8"/>
-    </w:p>
-    <w:p>
-      <w:pPr>
-        <w:pStyle w:val="a6"/>
-        <w:numPr>
-          <w:ilvl w:val="0"/>
-          <w:numId w:val="20"/>
-        </w:numPr>
-        <w:spacing w:line="276" w:lineRule="auto"/>
-        <w:jc w:val="both"/>
-        <w:rPr>
-          <w:b/>
-          <w:bCs/>
-          <w:sz w:val="20"/>
-          <w:szCs w:val="20"/>
-        </w:rPr>
-      </w:pPr>
-      <w:r>
-        <w:rPr>
-          <w:rFonts w:hint="eastAsia"/>
-          <w:b/>
-          <w:bCs/>
-          <w:sz w:val="20"/>
-          <w:szCs w:val="20"/>
-        </w:rPr>
-        <w:t xml:space="preserve">기존의 게임 </w:t>
-      </w:r>
-      <w:r>
-        <w:rPr>
-          <w:b/>
-          <w:bCs/>
-          <w:sz w:val="20"/>
-          <w:szCs w:val="20"/>
-        </w:rPr>
-        <w:t>IP</w:t>
-      </w:r>
-      <w:r>
-        <w:rPr>
-          <w:rFonts w:hint="eastAsia"/>
-          <w:b/>
-          <w:bCs/>
-          <w:sz w:val="20"/>
-          <w:szCs w:val="20"/>
-        </w:rPr>
-        <w:t>의</w:t>
-      </w:r>
-      <w:r>
-        <w:rPr>
-          <w:rFonts w:hint="eastAsia"/>
-          <w:b/>
-          <w:bCs/>
-          <w:sz w:val="20"/>
-          <w:szCs w:val="20"/>
-        </w:rPr>
+        <w:lastRenderedPageBreak/>
         <w:t xml:space="preserve"> </w:t>
       </w:r>
-      <w:r>
-        <w:rPr>
-          <w:rFonts w:hint="eastAsia"/>
-          <w:b/>
-          <w:bCs/>
-          <w:sz w:val="20"/>
-          <w:szCs w:val="20"/>
-        </w:rPr>
-        <w:t>효율적</w:t>
-      </w:r>
-      <w:r>
-        <w:rPr>
-          <w:rFonts w:hint="eastAsia"/>
-          <w:b/>
-          <w:bCs/>
-          <w:sz w:val="20"/>
-          <w:szCs w:val="20"/>
-        </w:rPr>
-        <w:t>인</w:t>
-      </w:r>
-      <w:r>
-        <w:rPr>
-          <w:rFonts w:hint="eastAsia"/>
-          <w:b/>
-          <w:bCs/>
-          <w:sz w:val="20"/>
-          <w:szCs w:val="20"/>
-        </w:rPr>
-        <w:t xml:space="preserve"> </w:t>
-      </w:r>
-      <w:r>
-        <w:rPr>
-          <w:rFonts w:hint="eastAsia"/>
-          <w:b/>
-          <w:bCs/>
-          <w:sz w:val="20"/>
-          <w:szCs w:val="20"/>
-        </w:rPr>
-        <w:t>활용</w:t>
-      </w:r>
-      <w:r>
-        <w:rPr>
-          <w:rFonts w:hint="eastAsia"/>
-          <w:b/>
-          <w:bCs/>
-          <w:sz w:val="20"/>
-          <w:szCs w:val="20"/>
-        </w:rPr>
-        <w:t xml:space="preserve"> </w:t>
-      </w:r>
-      <w:r>
-        <w:rPr>
-          <w:rFonts w:hint="eastAsia"/>
-          <w:b/>
-          <w:bCs/>
-          <w:sz w:val="20"/>
-          <w:szCs w:val="20"/>
-        </w:rPr>
-        <w:t>방안</w:t>
-      </w:r>
-      <w:r>
-        <w:rPr>
-          <w:rFonts w:hint="eastAsia"/>
-          <w:b/>
-          <w:bCs/>
-          <w:sz w:val="20"/>
-          <w:szCs w:val="20"/>
-        </w:rPr>
-        <w:t xml:space="preserve"> 제시</w:t>
-      </w:r>
-    </w:p>
-    <w:p>
-      <w:pPr>
-        <w:pStyle w:val="a6"/>
-        <w:spacing w:line="276" w:lineRule="auto"/>
-        <w:ind w:left="800"/>
-        <w:jc w:val="both"/>
-        <w:rPr>
-          <w:sz w:val="20"/>
-          <w:szCs w:val="20"/>
-        </w:rPr>
-      </w:pPr>
-    </w:p>
-    <w:p>
-      <w:pPr>
-        <w:pStyle w:val="a6"/>
-        <w:spacing w:line="276" w:lineRule="auto"/>
-        <w:ind w:left="800"/>
-        <w:jc w:val="both"/>
-        <w:rPr>
-          <w:sz w:val="20"/>
-          <w:szCs w:val="20"/>
-        </w:rPr>
-      </w:pPr>
-    </w:p>
-    <w:p>
-      <w:pPr>
-        <w:pStyle w:val="a6"/>
-        <w:numPr>
-          <w:ilvl w:val="0"/>
-          <w:numId w:val="20"/>
-        </w:numPr>
-        <w:spacing w:line="276" w:lineRule="auto"/>
-        <w:jc w:val="both"/>
-        <w:rPr>
-          <w:b/>
-          <w:bCs/>
-          <w:sz w:val="20"/>
-          <w:szCs w:val="20"/>
-        </w:rPr>
-      </w:pPr>
-      <w:r>
-        <w:rPr>
-          <w:rFonts w:hint="eastAsia"/>
-          <w:b/>
-          <w:bCs/>
-          <w:sz w:val="20"/>
-          <w:szCs w:val="20"/>
-        </w:rPr>
-        <w:t xml:space="preserve">게임 개발 측면에서 </w:t>
-      </w:r>
-      <w:r>
-        <w:rPr>
-          <w:b/>
-          <w:bCs/>
-          <w:sz w:val="20"/>
-          <w:szCs w:val="20"/>
-        </w:rPr>
-        <w:t>Rust</w:t>
-      </w:r>
-      <w:r>
-        <w:rPr>
-          <w:rFonts w:hint="eastAsia"/>
-          <w:b/>
-          <w:bCs/>
-          <w:sz w:val="20"/>
-          <w:szCs w:val="20"/>
-        </w:rPr>
-        <w:t xml:space="preserve"> 언</w:t>
-      </w:r>
-      <w:r>
-        <w:rPr>
-          <w:rFonts w:hint="eastAsia"/>
-          <w:b/>
-          <w:bCs/>
-          <w:sz w:val="20"/>
-          <w:szCs w:val="20"/>
-        </w:rPr>
-        <w:t>어</w:t>
-      </w:r>
-      <w:r>
-        <w:rPr>
-          <w:rFonts w:hint="eastAsia"/>
-          <w:b/>
-          <w:bCs/>
-          <w:sz w:val="20"/>
-          <w:szCs w:val="20"/>
-        </w:rPr>
-        <w:t>의</w:t>
-      </w:r>
-      <w:r>
-        <w:rPr>
-          <w:rFonts w:hint="eastAsia"/>
-          <w:b/>
-          <w:bCs/>
-          <w:sz w:val="20"/>
-          <w:szCs w:val="20"/>
-        </w:rPr>
-        <w:t xml:space="preserve"> 평가 및 활용방안 제시</w:t>
-      </w:r>
-    </w:p>
-    <w:p>
-      <w:pPr>
-        <w:pStyle w:val="a6"/>
-        <w:spacing w:line="276" w:lineRule="auto"/>
-        <w:ind w:left="800"/>
-        <w:jc w:val="both"/>
-        <w:rPr>
-          <w:sz w:val="20"/>
-          <w:szCs w:val="20"/>
-        </w:rPr>
-      </w:pPr>
-    </w:p>
-    <w:p>
-      <w:pPr>
-        <w:pStyle w:val="a6"/>
-        <w:spacing w:line="276" w:lineRule="auto"/>
-        <w:ind w:left="800"/>
-        <w:jc w:val="both"/>
-        <w:rPr>
-          <w:sz w:val="20"/>
-          <w:szCs w:val="20"/>
-        </w:rPr>
-      </w:pPr>
-    </w:p>
-    <w:p>
-      <w:pPr>
-        <w:pStyle w:val="a6"/>
-        <w:numPr>
-          <w:ilvl w:val="0"/>
-          <w:numId w:val="20"/>
-        </w:numPr>
-        <w:spacing w:line="276" w:lineRule="auto"/>
-        <w:jc w:val="both"/>
-        <w:rPr>
-          <w:b/>
-          <w:bCs/>
-          <w:sz w:val="20"/>
-          <w:szCs w:val="20"/>
-        </w:rPr>
-      </w:pPr>
-      <w:r>
-        <w:rPr>
-          <w:b/>
-          <w:bCs/>
-          <w:sz w:val="20"/>
-          <w:szCs w:val="20"/>
-        </w:rPr>
-        <w:t xml:space="preserve">Lock-Free </w:t>
-      </w:r>
-      <w:r>
-        <w:rPr>
-          <w:rFonts w:hint="eastAsia"/>
-          <w:b/>
-          <w:bCs/>
-          <w:sz w:val="20"/>
-          <w:szCs w:val="20"/>
-        </w:rPr>
-        <w:t>자료 구</w:t>
-      </w:r>
-      <w:r>
-        <w:rPr>
-          <w:rFonts w:hint="eastAsia"/>
-          <w:b/>
-          <w:bCs/>
-          <w:sz w:val="20"/>
-          <w:szCs w:val="20"/>
-        </w:rPr>
-        <w:t>조</w:t>
-      </w:r>
-      <w:r>
-        <w:rPr>
-          <w:rFonts w:hint="eastAsia"/>
-          <w:b/>
-          <w:bCs/>
-          <w:sz w:val="20"/>
-          <w:szCs w:val="20"/>
-        </w:rPr>
-        <w:t>의</w:t>
-      </w:r>
-      <w:r>
-        <w:rPr>
-          <w:rFonts w:hint="eastAsia"/>
-          <w:b/>
-          <w:bCs/>
-          <w:sz w:val="20"/>
-          <w:szCs w:val="20"/>
-        </w:rPr>
-        <w:t xml:space="preserve"> </w:t>
-      </w:r>
-      <w:r>
-        <w:rPr>
-          <w:rFonts w:hint="eastAsia"/>
-          <w:b/>
-          <w:bCs/>
-          <w:sz w:val="20"/>
-          <w:szCs w:val="20"/>
-        </w:rPr>
-        <w:t>이해</w:t>
-      </w:r>
-      <w:r>
-        <w:rPr>
-          <w:rFonts w:hint="eastAsia"/>
-          <w:b/>
-          <w:bCs/>
-          <w:sz w:val="20"/>
-          <w:szCs w:val="20"/>
-        </w:rPr>
-        <w:t>와 활용</w:t>
-      </w:r>
-    </w:p>
-    <w:p>
-      <w:pPr>
-        <w:pStyle w:val="a6"/>
-        <w:spacing w:line="276" w:lineRule="auto"/>
-        <w:ind w:left="800"/>
-        <w:jc w:val="both"/>
-        <w:rPr>
-          <w:sz w:val="20"/>
-          <w:szCs w:val="20"/>
-        </w:rPr>
-      </w:pPr>
-    </w:p>
-    <w:p>
-      <w:pPr>
-        <w:pStyle w:val="a6"/>
-        <w:spacing w:line="276" w:lineRule="auto"/>
-        <w:ind w:left="800"/>
-        <w:jc w:val="both"/>
-        <w:rPr>
-          <w:sz w:val="20"/>
-          <w:szCs w:val="20"/>
-        </w:rPr>
-      </w:pPr>
-    </w:p>
-    <w:p>
-      <w:pPr>
-        <w:pStyle w:val="a6"/>
-        <w:numPr>
-          <w:ilvl w:val="0"/>
-          <w:numId w:val="20"/>
-        </w:numPr>
-        <w:spacing w:line="276" w:lineRule="auto"/>
-        <w:jc w:val="both"/>
-        <w:rPr>
-          <w:b/>
-          <w:bCs/>
-          <w:sz w:val="20"/>
-          <w:szCs w:val="20"/>
-        </w:rPr>
-      </w:pPr>
-      <w:r>
-        <w:rPr>
-          <w:b/>
-          <w:bCs/>
-          <w:sz w:val="20"/>
-          <w:szCs w:val="20"/>
-        </w:rPr>
-        <w:t>Cross-</w:t>
-      </w:r>
-      <w:r>
-        <w:rPr>
-          <w:b/>
-          <w:bCs/>
-          <w:sz w:val="20"/>
-          <w:szCs w:val="20"/>
-        </w:rPr>
-        <w:t>P</w:t>
-      </w:r>
-      <w:r>
-        <w:rPr>
-          <w:b/>
-          <w:bCs/>
-          <w:sz w:val="20"/>
-          <w:szCs w:val="20"/>
-        </w:rPr>
-        <w:t>latform</w:t>
-      </w:r>
-      <w:r>
-        <w:rPr>
-          <w:rFonts w:hint="eastAsia"/>
-          <w:b/>
-          <w:bCs/>
-          <w:sz w:val="20"/>
-          <w:szCs w:val="20"/>
-        </w:rPr>
-        <w:t xml:space="preserve"> 게임 개</w:t>
-      </w:r>
-      <w:r>
-        <w:rPr>
-          <w:rFonts w:hint="eastAsia"/>
-          <w:b/>
-          <w:bCs/>
-          <w:sz w:val="20"/>
-          <w:szCs w:val="20"/>
-        </w:rPr>
-        <w:t>발</w:t>
-      </w:r>
-      <w:r>
-        <w:rPr>
-          <w:rFonts w:hint="eastAsia"/>
-          <w:b/>
-          <w:bCs/>
-          <w:sz w:val="20"/>
-          <w:szCs w:val="20"/>
-        </w:rPr>
-        <w:t xml:space="preserve"> 중 발생하는 문제와 </w:t>
-      </w:r>
-      <w:r>
-        <w:rPr>
-          <w:rFonts w:hint="eastAsia"/>
-          <w:b/>
-          <w:bCs/>
-          <w:sz w:val="20"/>
-          <w:szCs w:val="20"/>
-        </w:rPr>
-        <w:t>해결 방안 탐</w:t>
-      </w:r>
-      <w:r>
-        <w:rPr>
-          <w:rFonts w:hint="eastAsia"/>
-          <w:b/>
-          <w:bCs/>
-          <w:sz w:val="20"/>
-          <w:szCs w:val="20"/>
-        </w:rPr>
-        <w:t>구</w:t>
-      </w:r>
-    </w:p>
-    <w:p>
-      <w:pPr>
-        <w:pStyle w:val="a6"/>
-        <w:spacing w:line="276" w:lineRule="auto"/>
-        <w:ind w:left="800"/>
-        <w:jc w:val="both"/>
-        <w:rPr>
-          <w:sz w:val="20"/>
-          <w:szCs w:val="20"/>
-        </w:rPr>
-      </w:pPr>
-    </w:p>
-    <w:p>
-      <w:pPr>
-        <w:pStyle w:val="a6"/>
-        <w:spacing w:line="276" w:lineRule="auto"/>
-        <w:ind w:left="800"/>
-        <w:jc w:val="both"/>
-        <w:rPr>
-          <w:sz w:val="20"/>
-          <w:szCs w:val="20"/>
-        </w:rPr>
-      </w:pPr>
-    </w:p>
-    <w:p>
-      <w:pPr>
-        <w:spacing w:line="276" w:lineRule="auto"/>
-        <w:jc w:val="both"/>
-        <w:rPr>
-          <w:sz w:val="20"/>
-          <w:szCs w:val="20"/>
-        </w:rPr>
-      </w:pPr>
-    </w:p>
-    <w:p>
-      <w:pPr>
-        <w:spacing w:line="276" w:lineRule="auto"/>
-        <w:jc w:val="both"/>
-        <w:rPr>
-          <w:sz w:val="20"/>
-          <w:szCs w:val="20"/>
-        </w:rPr>
-      </w:pPr>
-    </w:p>
-    <w:p>
-      <w:pPr>
-        <w:widowControl/>
-        <w:wordWrap/>
-        <w:autoSpaceDE/>
-        <w:autoSpaceDN/>
-        <w:rPr>
-          <w:sz w:val="20"/>
-          <w:szCs w:val="20"/>
-        </w:rPr>
-      </w:pPr>
-      <w:r>
-        <w:rPr>
-          <w:sz w:val="20"/>
-          <w:szCs w:val="20"/>
-        </w:rPr>
-        <w:br w:type="page"/>
-      </w:r>
-    </w:p>
-    <w:p>
-      <w:pPr>
-        <w:pStyle w:val="1"/>
-        <w:rPr>
-          <w:b/>
-          <w:bCs/>
-          <w:sz w:val="48"/>
-          <w:szCs w:val="48"/>
-        </w:rPr>
-      </w:pPr>
       <w:r>
         <w:rPr>
           <w:rFonts w:hint="eastAsia"/>
@@ -6429,10 +4696,70 @@
           <w:sz w:val="48"/>
           <w:szCs w:val="48"/>
         </w:rPr>
-        <w:lastRenderedPageBreak/>
-        <w:t xml:space="preserve"> </w:t>
-      </w:r>
-      <w:bookmarkStart w:id="9" w:name="_Toc178151263"/>
+        <w:t>중점 연구 분야</w:t>
+      </w:r>
+      <w:bookmarkEnd w:id="3"/>
+    </w:p>
+    <w:p>
+      <w:pPr>
+        <w:spacing w:line="276" w:lineRule="auto"/>
+        <w:jc w:val="both"/>
+        <w:rPr>
+          <w:sz w:val="20"/>
+          <w:szCs w:val="20"/>
+        </w:rPr>
+      </w:pPr>
+    </w:p>
+    <w:p>
+      <w:pPr>
+        <w:spacing w:line="276" w:lineRule="auto"/>
+        <w:jc w:val="both"/>
+        <w:rPr>
+          <w:sz w:val="20"/>
+          <w:szCs w:val="20"/>
+        </w:rPr>
+      </w:pPr>
+    </w:p>
+    <w:p>
+      <w:pPr>
+        <w:spacing w:line="276" w:lineRule="auto"/>
+        <w:jc w:val="both"/>
+        <w:rPr>
+          <w:sz w:val="20"/>
+          <w:szCs w:val="20"/>
+        </w:rPr>
+      </w:pPr>
+    </w:p>
+    <w:p>
+      <w:pPr>
+        <w:widowControl/>
+        <w:wordWrap/>
+        <w:autoSpaceDE/>
+        <w:autoSpaceDN/>
+        <w:rPr>
+          <w:sz w:val="20"/>
+          <w:szCs w:val="20"/>
+        </w:rPr>
+      </w:pPr>
+      <w:r>
+        <w:rPr>
+          <w:sz w:val="20"/>
+          <w:szCs w:val="20"/>
+        </w:rPr>
+        <w:br w:type="page"/>
+      </w:r>
+    </w:p>
+    <w:p>
+      <w:pPr>
+        <w:pStyle w:val="1"/>
+        <w:rPr>
+          <w:b/>
+          <w:bCs/>
+          <w:sz w:val="48"/>
+          <w:szCs w:val="48"/>
+        </w:rPr>
+      </w:pPr>
+      <w:bookmarkStart w:id="4" w:name="_Toc176470549"/>
       <w:r>
         <w:rPr>
           <w:rFonts w:hint="eastAsia"/>
@@ -6441,9 +4768,20 @@
           <w:sz w:val="48"/>
           <w:szCs w:val="48"/>
         </w:rPr>
+        <w:lastRenderedPageBreak/>
+        <w:t xml:space="preserve"> </w:t>
+      </w:r>
+      <w:r>
+        <w:rPr>
+          <w:rFonts w:hint="eastAsia"/>
+          <w:b/>
+          <w:bCs/>
+          <w:sz w:val="48"/>
+          <w:szCs w:val="48"/>
+        </w:rPr>
         <w:t>개발 일정</w:t>
       </w:r>
-      <w:bookmarkEnd w:id="9"/>
+      <w:bookmarkEnd w:id="4"/>
     </w:p>
     <w:p>
       <w:pPr>
@@ -6476,7 +4814,7 @@
       </w:pPr>
     </w:p>
     <w:sectPr>
-      <w:footerReference w:type="default" r:id="rId19"/>
+      <w:footerReference w:type="default" r:id="rId15"/>
       <w:pgSz w:w="11906" w:h="16838"/>
       <w:pgMar w:top="1701" w:right="1440" w:bottom="1440" w:left="1440" w:header="851" w:footer="850" w:gutter="0"/>
       <w:pgNumType w:fmt="numberInDash" w:start="1" w:chapStyle="1"/>
@@ -6894,95 +5232,6 @@
     </w:lvl>
   </w:abstractNum>
   <w:abstractNum w:abstractNumId="2" w15:restartNumberingAfterBreak="0">
-    <w:nsid w:val="08B41330"/>
-    <w:multiLevelType w:val="hybridMultilevel"/>
-    <w:tmpl w:val="B35683D6"/>
-    <w:lvl w:ilvl="0" w:tplc="3564AE84">
-      <w:start w:val="1"/>
-      <w:numFmt w:val="decimal"/>
-      <w:lvlText w:val="%1."/>
-      <w:lvlJc w:val="left"/>
-      <w:pPr>
-        <w:ind w:left="800" w:hanging="360"/>
-      </w:pPr>
-      <w:rPr>
-        <w:rFonts w:hint="default"/>
-      </w:rPr>
-    </w:lvl>
-    <w:lvl w:ilvl="1" w:tplc="04090019" w:tentative="1">
-      <w:start w:val="1"/>
-      <w:numFmt w:val="upperLetter"/>
-      <w:lvlText w:val="%2."/>
-      <w:lvlJc w:val="left"/>
-      <w:pPr>
-        <w:ind w:left="1320" w:hanging="440"/>
-      </w:pPr>
-    </w:lvl>
-    <w:lvl w:ilvl="2" w:tplc="0409001B" w:tentative="1">
-      <w:start w:val="1"/>
-      <w:numFmt w:val="lowerRoman"/>
-      <w:lvlText w:val="%3."/>
-      <w:lvlJc w:val="right"/>
-      <w:pPr>
-        <w:ind w:left="1760" w:hanging="440"/>
-      </w:pPr>
-    </w:lvl>
-    <w:lvl w:ilvl="3" w:tplc="0409000F" w:tentative="1">
-      <w:start w:val="1"/>
-      <w:numFmt w:val="decimal"/>
-      <w:lvlText w:val="%4."/>
-      <w:lvlJc w:val="left"/>
-      <w:pPr>
-        <w:ind w:left="2200" w:hanging="440"/>
-      </w:pPr>
-    </w:lvl>
-    <w:lvl w:ilvl="4" w:tplc="04090019" w:tentative="1">
-      <w:start w:val="1"/>
-      <w:numFmt w:val="upperLetter"/>
-      <w:lvlText w:val="%5."/>
-      <w:lvlJc w:val="left"/>
-      <w:pPr>
-        <w:ind w:left="2640" w:hanging="440"/>
-      </w:pPr>
-    </w:lvl>
-    <w:lvl w:ilvl="5" w:tplc="0409001B" w:tentative="1">
-      <w:start w:val="1"/>
-      <w:numFmt w:val="lowerRoman"/>
-      <w:lvlText w:val="%6."/>
-      <w:lvlJc w:val="right"/>
-      <w:pPr>
-        <w:ind w:left="3080" w:hanging="440"/>
-      </w:pPr>
-    </w:lvl>
-    <w:lvl w:ilvl="6" w:tplc="0409000F" w:tentative="1">
-      <w:start w:val="1"/>
-      <w:numFmt w:val="decimal"/>
-      <w:lvlText w:val="%7."/>
-      <w:lvlJc w:val="left"/>
-      <w:pPr>
-        <w:ind w:left="3520" w:hanging="440"/>
-      </w:pPr>
-    </w:lvl>
-    <w:lvl w:ilvl="7" w:tplc="04090019" w:tentative="1">
-      <w:start w:val="1"/>
-      <w:numFmt w:val="upperLetter"/>
-      <w:lvlText w:val="%8."/>
-      <w:lvlJc w:val="left"/>
-      <w:pPr>
-        <w:ind w:left="3960" w:hanging="440"/>
-      </w:pPr>
-    </w:lvl>
-    <w:lvl w:ilvl="8" w:tplc="0409001B" w:tentative="1">
-      <w:start w:val="1"/>
-      <w:numFmt w:val="lowerRoman"/>
-      <w:lvlText w:val="%9."/>
-      <w:lvlJc w:val="right"/>
-      <w:pPr>
-        <w:ind w:left="4400" w:hanging="440"/>
-      </w:pPr>
-    </w:lvl>
-  </w:abstractNum>
-  <w:abstractNum w:abstractNumId="3" w15:restartNumberingAfterBreak="0">
     <w:nsid w:val="0CB24DD6"/>
     <w:multiLevelType w:val="hybridMultilevel"/>
     <w:tmpl w:val="DB12D390"/>
@@ -7094,120 +5343,7 @@
       </w:rPr>
     </w:lvl>
   </w:abstractNum>
-  <w:abstractNum w:abstractNumId="4" w15:restartNumberingAfterBreak="0">
-    <w:nsid w:val="116456D9"/>
-    <w:multiLevelType w:val="hybridMultilevel"/>
-    <w:tmpl w:val="232E1BDE"/>
-    <w:lvl w:ilvl="0" w:tplc="25AEEC42">
-      <w:start w:val="6"/>
-      <w:numFmt w:val="bullet"/>
-      <w:lvlText w:val="-"/>
-      <w:lvlJc w:val="left"/>
-      <w:pPr>
-        <w:ind w:left="1080" w:hanging="360"/>
-      </w:pPr>
-      <w:rPr>
-        <w:rFonts w:ascii="맑은 고딕" w:eastAsia="맑은 고딕" w:hAnsi="맑은 고딕" w:cstheme="minorBidi" w:hint="eastAsia"/>
-      </w:rPr>
-    </w:lvl>
-    <w:lvl w:ilvl="1" w:tplc="04090003" w:tentative="1">
-      <w:start w:val="1"/>
-      <w:numFmt w:val="bullet"/>
-      <w:lvlText w:val=""/>
-      <w:lvlJc w:val="left"/>
-      <w:pPr>
-        <w:ind w:left="1600" w:hanging="440"/>
-      </w:pPr>
-      <w:rPr>
-        <w:rFonts w:ascii="Wingdings" w:hAnsi="Wingdings" w:hint="default"/>
-      </w:rPr>
-    </w:lvl>
-    <w:lvl w:ilvl="2" w:tplc="04090005" w:tentative="1">
-      <w:start w:val="1"/>
-      <w:numFmt w:val="bullet"/>
-      <w:lvlText w:val=""/>
-      <w:lvlJc w:val="left"/>
-      <w:pPr>
-        <w:ind w:left="2040" w:hanging="440"/>
-      </w:pPr>
-      <w:rPr>
-        <w:rFonts w:ascii="Wingdings" w:hAnsi="Wingdings" w:hint="default"/>
-      </w:rPr>
-    </w:lvl>
-    <w:lvl w:ilvl="3" w:tplc="04090001" w:tentative="1">
-      <w:start w:val="1"/>
-      <w:numFmt w:val="bullet"/>
-      <w:lvlText w:val=""/>
-      <w:lvlJc w:val="left"/>
-      <w:pPr>
-        <w:ind w:left="2480" w:hanging="440"/>
-      </w:pPr>
-      <w:rPr>
-        <w:rFonts w:ascii="Wingdings" w:hAnsi="Wingdings" w:hint="default"/>
-      </w:rPr>
-    </w:lvl>
-    <w:lvl w:ilvl="4" w:tplc="04090003" w:tentative="1">
-      <w:start w:val="1"/>
-      <w:numFmt w:val="bullet"/>
-      <w:lvlText w:val=""/>
-      <w:lvlJc w:val="left"/>
-      <w:pPr>
-        <w:ind w:left="2920" w:hanging="440"/>
-      </w:pPr>
-      <w:rPr>
-        <w:rFonts w:ascii="Wingdings" w:hAnsi="Wingdings" w:hint="default"/>
-      </w:rPr>
-    </w:lvl>
-    <w:lvl w:ilvl="5" w:tplc="04090005" w:tentative="1">
-      <w:start w:val="1"/>
-      <w:numFmt w:val="bullet"/>
-      <w:lvlText w:val=""/>
-      <w:lvlJc w:val="left"/>
-      <w:pPr>
-        <w:ind w:left="3360" w:hanging="440"/>
-      </w:pPr>
-      <w:rPr>
-        <w:rFonts w:ascii="Wingdings" w:hAnsi="Wingdings" w:hint="default"/>
-      </w:rPr>
-    </w:lvl>
-    <w:lvl w:ilvl="6" w:tplc="04090001" w:tentative="1">
-      <w:start w:val="1"/>
-      <w:numFmt w:val="bullet"/>
-      <w:lvlText w:val=""/>
-      <w:lvlJc w:val="left"/>
-      <w:pPr>
-        <w:ind w:left="3800" w:hanging="440"/>
-      </w:pPr>
-      <w:rPr>
-        <w:rFonts w:ascii="Wingdings" w:hAnsi="Wingdings" w:hint="default"/>
-      </w:rPr>
-    </w:lvl>
-    <w:lvl w:ilvl="7" w:tplc="04090003" w:tentative="1">
-      <w:start w:val="1"/>
-      <w:numFmt w:val="bullet"/>
-      <w:lvlText w:val=""/>
-      <w:lvlJc w:val="left"/>
-      <w:pPr>
-        <w:ind w:left="4240" w:hanging="440"/>
-      </w:pPr>
-      <w:rPr>
-        <w:rFonts w:ascii="Wingdings" w:hAnsi="Wingdings" w:hint="default"/>
-      </w:rPr>
-    </w:lvl>
-    <w:lvl w:ilvl="8" w:tplc="04090005" w:tentative="1">
-      <w:start w:val="1"/>
-      <w:numFmt w:val="bullet"/>
-      <w:lvlText w:val=""/>
-      <w:lvlJc w:val="left"/>
-      <w:pPr>
-        <w:ind w:left="4680" w:hanging="440"/>
-      </w:pPr>
-      <w:rPr>
-        <w:rFonts w:ascii="Wingdings" w:hAnsi="Wingdings" w:hint="default"/>
-      </w:rPr>
-    </w:lvl>
-  </w:abstractNum>
-  <w:abstractNum w:abstractNumId="5" w15:restartNumberingAfterBreak="0">
+  <w:abstractNum w:abstractNumId="3" w15:restartNumberingAfterBreak="0">
     <w:nsid w:val="15133F8F"/>
     <w:multiLevelType w:val="hybridMultilevel"/>
     <w:tmpl w:val="0ACA2A18"/>
@@ -7217,7 +5353,7 @@
       <w:lvlText w:val=""/>
       <w:lvlJc w:val="left"/>
       <w:pPr>
-        <w:ind w:left="1820" w:hanging="440"/>
+        <w:ind w:left="1600" w:hanging="440"/>
       </w:pPr>
       <w:rPr>
         <w:rFonts w:ascii="Wingdings" w:hAnsi="Wingdings" w:hint="default"/>
@@ -7229,7 +5365,7 @@
       <w:lvlText w:val=""/>
       <w:lvlJc w:val="left"/>
       <w:pPr>
-        <w:ind w:left="2260" w:hanging="440"/>
+        <w:ind w:left="2040" w:hanging="440"/>
       </w:pPr>
       <w:rPr>
         <w:rFonts w:ascii="Wingdings" w:hAnsi="Wingdings" w:hint="default"/>
@@ -7241,7 +5377,7 @@
       <w:lvlText w:val=""/>
       <w:lvlJc w:val="left"/>
       <w:pPr>
-        <w:ind w:left="2700" w:hanging="440"/>
+        <w:ind w:left="2480" w:hanging="440"/>
       </w:pPr>
       <w:rPr>
         <w:rFonts w:ascii="Wingdings" w:hAnsi="Wingdings" w:hint="default"/>
@@ -7253,7 +5389,7 @@
       <w:lvlText w:val=""/>
       <w:lvlJc w:val="left"/>
       <w:pPr>
-        <w:ind w:left="3140" w:hanging="440"/>
+        <w:ind w:left="2920" w:hanging="440"/>
       </w:pPr>
       <w:rPr>
         <w:rFonts w:ascii="Wingdings" w:hAnsi="Wingdings" w:hint="default"/>
@@ -7265,7 +5401,7 @@
       <w:lvlText w:val=""/>
       <w:lvlJc w:val="left"/>
       <w:pPr>
-        <w:ind w:left="3580" w:hanging="440"/>
+        <w:ind w:left="3360" w:hanging="440"/>
       </w:pPr>
       <w:rPr>
         <w:rFonts w:ascii="Wingdings" w:hAnsi="Wingdings" w:hint="default"/>
@@ -7277,7 +5413,7 @@
       <w:lvlText w:val=""/>
       <w:lvlJc w:val="left"/>
       <w:pPr>
-        <w:ind w:left="4020" w:hanging="440"/>
+        <w:ind w:left="3800" w:hanging="440"/>
       </w:pPr>
       <w:rPr>
         <w:rFonts w:ascii="Wingdings" w:hAnsi="Wingdings" w:hint="default"/>
@@ -7289,7 +5425,7 @@
       <w:lvlText w:val=""/>
       <w:lvlJc w:val="left"/>
       <w:pPr>
-        <w:ind w:left="4460" w:hanging="440"/>
+        <w:ind w:left="4240" w:hanging="440"/>
       </w:pPr>
       <w:rPr>
         <w:rFonts w:ascii="Wingdings" w:hAnsi="Wingdings" w:hint="default"/>
@@ -7301,7 +5437,7 @@
       <w:lvlText w:val=""/>
       <w:lvlJc w:val="left"/>
       <w:pPr>
-        <w:ind w:left="4900" w:hanging="440"/>
+        <w:ind w:left="4680" w:hanging="440"/>
       </w:pPr>
       <w:rPr>
         <w:rFonts w:ascii="Wingdings" w:hAnsi="Wingdings" w:hint="default"/>
@@ -7313,14 +5449,14 @@
       <w:lvlText w:val=""/>
       <w:lvlJc w:val="left"/>
       <w:pPr>
-        <w:ind w:left="5340" w:hanging="440"/>
+        <w:ind w:left="5120" w:hanging="440"/>
       </w:pPr>
       <w:rPr>
         <w:rFonts w:ascii="Wingdings" w:hAnsi="Wingdings" w:hint="default"/>
       </w:rPr>
     </w:lvl>
   </w:abstractNum>
-  <w:abstractNum w:abstractNumId="6" w15:restartNumberingAfterBreak="0">
+  <w:abstractNum w:abstractNumId="4" w15:restartNumberingAfterBreak="0">
     <w:nsid w:val="1D253E6C"/>
     <w:multiLevelType w:val="hybridMultilevel"/>
     <w:tmpl w:val="24C86CDA"/>
@@ -7433,7 +5569,7 @@
       </w:rPr>
     </w:lvl>
   </w:abstractNum>
-  <w:abstractNum w:abstractNumId="7" w15:restartNumberingAfterBreak="0">
+  <w:abstractNum w:abstractNumId="5" w15:restartNumberingAfterBreak="0">
     <w:nsid w:val="1D2B3599"/>
     <w:multiLevelType w:val="hybridMultilevel"/>
     <w:tmpl w:val="EE18AF0E"/>
@@ -7546,120 +5682,7 @@
       </w:rPr>
     </w:lvl>
   </w:abstractNum>
-  <w:abstractNum w:abstractNumId="8" w15:restartNumberingAfterBreak="0">
-    <w:nsid w:val="1D336AC5"/>
-    <w:multiLevelType w:val="hybridMultilevel"/>
-    <w:tmpl w:val="3DD0B184"/>
-    <w:lvl w:ilvl="0" w:tplc="04090001">
-      <w:start w:val="1"/>
-      <w:numFmt w:val="bullet"/>
-      <w:lvlText w:val=""/>
-      <w:lvlJc w:val="left"/>
-      <w:pPr>
-        <w:ind w:left="2040" w:hanging="440"/>
-      </w:pPr>
-      <w:rPr>
-        <w:rFonts w:ascii="Wingdings" w:hAnsi="Wingdings" w:hint="default"/>
-      </w:rPr>
-    </w:lvl>
-    <w:lvl w:ilvl="1" w:tplc="04090003" w:tentative="1">
-      <w:start w:val="1"/>
-      <w:numFmt w:val="bullet"/>
-      <w:lvlText w:val=""/>
-      <w:lvlJc w:val="left"/>
-      <w:pPr>
-        <w:ind w:left="2480" w:hanging="440"/>
-      </w:pPr>
-      <w:rPr>
-        <w:rFonts w:ascii="Wingdings" w:hAnsi="Wingdings" w:hint="default"/>
-      </w:rPr>
-    </w:lvl>
-    <w:lvl w:ilvl="2" w:tplc="04090005" w:tentative="1">
-      <w:start w:val="1"/>
-      <w:numFmt w:val="bullet"/>
-      <w:lvlText w:val=""/>
-      <w:lvlJc w:val="left"/>
-      <w:pPr>
-        <w:ind w:left="2920" w:hanging="440"/>
-      </w:pPr>
-      <w:rPr>
-        <w:rFonts w:ascii="Wingdings" w:hAnsi="Wingdings" w:hint="default"/>
-      </w:rPr>
-    </w:lvl>
-    <w:lvl w:ilvl="3" w:tplc="04090001" w:tentative="1">
-      <w:start w:val="1"/>
-      <w:numFmt w:val="bullet"/>
-      <w:lvlText w:val=""/>
-      <w:lvlJc w:val="left"/>
-      <w:pPr>
-        <w:ind w:left="3360" w:hanging="440"/>
-      </w:pPr>
-      <w:rPr>
-        <w:rFonts w:ascii="Wingdings" w:hAnsi="Wingdings" w:hint="default"/>
-      </w:rPr>
-    </w:lvl>
-    <w:lvl w:ilvl="4" w:tplc="04090003" w:tentative="1">
-      <w:start w:val="1"/>
-      <w:numFmt w:val="bullet"/>
-      <w:lvlText w:val=""/>
-      <w:lvlJc w:val="left"/>
-      <w:pPr>
-        <w:ind w:left="3800" w:hanging="440"/>
-      </w:pPr>
-      <w:rPr>
-        <w:rFonts w:ascii="Wingdings" w:hAnsi="Wingdings" w:hint="default"/>
-      </w:rPr>
-    </w:lvl>
-    <w:lvl w:ilvl="5" w:tplc="04090005" w:tentative="1">
-      <w:start w:val="1"/>
-      <w:numFmt w:val="bullet"/>
-      <w:lvlText w:val=""/>
-      <w:lvlJc w:val="left"/>
-      <w:pPr>
-        <w:ind w:left="4240" w:hanging="440"/>
-      </w:pPr>
-      <w:rPr>
-        <w:rFonts w:ascii="Wingdings" w:hAnsi="Wingdings" w:hint="default"/>
-      </w:rPr>
-    </w:lvl>
-    <w:lvl w:ilvl="6" w:tplc="04090001" w:tentative="1">
-      <w:start w:val="1"/>
-      <w:numFmt w:val="bullet"/>
-      <w:lvlText w:val=""/>
-      <w:lvlJc w:val="left"/>
-      <w:pPr>
-        <w:ind w:left="4680" w:hanging="440"/>
-      </w:pPr>
-      <w:rPr>
-        <w:rFonts w:ascii="Wingdings" w:hAnsi="Wingdings" w:hint="default"/>
-      </w:rPr>
-    </w:lvl>
-    <w:lvl w:ilvl="7" w:tplc="04090003" w:tentative="1">
-      <w:start w:val="1"/>
-      <w:numFmt w:val="bullet"/>
-      <w:lvlText w:val=""/>
-      <w:lvlJc w:val="left"/>
-      <w:pPr>
-        <w:ind w:left="5120" w:hanging="440"/>
-      </w:pPr>
-      <w:rPr>
-        <w:rFonts w:ascii="Wingdings" w:hAnsi="Wingdings" w:hint="default"/>
-      </w:rPr>
-    </w:lvl>
-    <w:lvl w:ilvl="8" w:tplc="04090005" w:tentative="1">
-      <w:start w:val="1"/>
-      <w:numFmt w:val="bullet"/>
-      <w:lvlText w:val=""/>
-      <w:lvlJc w:val="left"/>
-      <w:pPr>
-        <w:ind w:left="5560" w:hanging="440"/>
-      </w:pPr>
-      <w:rPr>
-        <w:rFonts w:ascii="Wingdings" w:hAnsi="Wingdings" w:hint="default"/>
-      </w:rPr>
-    </w:lvl>
-  </w:abstractNum>
-  <w:abstractNum w:abstractNumId="9" w15:restartNumberingAfterBreak="0">
+  <w:abstractNum w:abstractNumId="6" w15:restartNumberingAfterBreak="0">
     <w:nsid w:val="2A140797"/>
     <w:multiLevelType w:val="hybridMultilevel"/>
     <w:tmpl w:val="2182D9F2"/>
@@ -7772,120 +5795,7 @@
       </w:rPr>
     </w:lvl>
   </w:abstractNum>
-  <w:abstractNum w:abstractNumId="10" w15:restartNumberingAfterBreak="0">
-    <w:nsid w:val="34334B1E"/>
-    <w:multiLevelType w:val="hybridMultilevel"/>
-    <w:tmpl w:val="E56AC3F2"/>
-    <w:lvl w:ilvl="0" w:tplc="2A660B96">
-      <w:start w:val="6"/>
-      <w:numFmt w:val="bullet"/>
-      <w:lvlText w:val="-"/>
-      <w:lvlJc w:val="left"/>
-      <w:pPr>
-        <w:ind w:left="1381" w:hanging="360"/>
-      </w:pPr>
-      <w:rPr>
-        <w:rFonts w:ascii="맑은 고딕" w:eastAsia="맑은 고딕" w:hAnsi="맑은 고딕" w:cstheme="minorBidi" w:hint="eastAsia"/>
-      </w:rPr>
-    </w:lvl>
-    <w:lvl w:ilvl="1" w:tplc="04090003" w:tentative="1">
-      <w:start w:val="1"/>
-      <w:numFmt w:val="bullet"/>
-      <w:lvlText w:val=""/>
-      <w:lvlJc w:val="left"/>
-      <w:pPr>
-        <w:ind w:left="1901" w:hanging="440"/>
-      </w:pPr>
-      <w:rPr>
-        <w:rFonts w:ascii="Wingdings" w:hAnsi="Wingdings" w:hint="default"/>
-      </w:rPr>
-    </w:lvl>
-    <w:lvl w:ilvl="2" w:tplc="04090005" w:tentative="1">
-      <w:start w:val="1"/>
-      <w:numFmt w:val="bullet"/>
-      <w:lvlText w:val=""/>
-      <w:lvlJc w:val="left"/>
-      <w:pPr>
-        <w:ind w:left="2341" w:hanging="440"/>
-      </w:pPr>
-      <w:rPr>
-        <w:rFonts w:ascii="Wingdings" w:hAnsi="Wingdings" w:hint="default"/>
-      </w:rPr>
-    </w:lvl>
-    <w:lvl w:ilvl="3" w:tplc="04090001" w:tentative="1">
-      <w:start w:val="1"/>
-      <w:numFmt w:val="bullet"/>
-      <w:lvlText w:val=""/>
-      <w:lvlJc w:val="left"/>
-      <w:pPr>
-        <w:ind w:left="2781" w:hanging="440"/>
-      </w:pPr>
-      <w:rPr>
-        <w:rFonts w:ascii="Wingdings" w:hAnsi="Wingdings" w:hint="default"/>
-      </w:rPr>
-    </w:lvl>
-    <w:lvl w:ilvl="4" w:tplc="04090003" w:tentative="1">
-      <w:start w:val="1"/>
-      <w:numFmt w:val="bullet"/>
-      <w:lvlText w:val=""/>
-      <w:lvlJc w:val="left"/>
-      <w:pPr>
-        <w:ind w:left="3221" w:hanging="440"/>
-      </w:pPr>
-      <w:rPr>
-        <w:rFonts w:ascii="Wingdings" w:hAnsi="Wingdings" w:hint="default"/>
-      </w:rPr>
-    </w:lvl>
-    <w:lvl w:ilvl="5" w:tplc="04090005" w:tentative="1">
-      <w:start w:val="1"/>
-      <w:numFmt w:val="bullet"/>
-      <w:lvlText w:val=""/>
-      <w:lvlJc w:val="left"/>
-      <w:pPr>
-        <w:ind w:left="3661" w:hanging="440"/>
-      </w:pPr>
-      <w:rPr>
-        <w:rFonts w:ascii="Wingdings" w:hAnsi="Wingdings" w:hint="default"/>
-      </w:rPr>
-    </w:lvl>
-    <w:lvl w:ilvl="6" w:tplc="04090001" w:tentative="1">
-      <w:start w:val="1"/>
-      <w:numFmt w:val="bullet"/>
-      <w:lvlText w:val=""/>
-      <w:lvlJc w:val="left"/>
-      <w:pPr>
-        <w:ind w:left="4101" w:hanging="440"/>
-      </w:pPr>
-      <w:rPr>
-        <w:rFonts w:ascii="Wingdings" w:hAnsi="Wingdings" w:hint="default"/>
-      </w:rPr>
-    </w:lvl>
-    <w:lvl w:ilvl="7" w:tplc="04090003" w:tentative="1">
-      <w:start w:val="1"/>
-      <w:numFmt w:val="bullet"/>
-      <w:lvlText w:val=""/>
-      <w:lvlJc w:val="left"/>
-      <w:pPr>
-        <w:ind w:left="4541" w:hanging="440"/>
-      </w:pPr>
-      <w:rPr>
-        <w:rFonts w:ascii="Wingdings" w:hAnsi="Wingdings" w:hint="default"/>
-      </w:rPr>
-    </w:lvl>
-    <w:lvl w:ilvl="8" w:tplc="04090005" w:tentative="1">
-      <w:start w:val="1"/>
-      <w:numFmt w:val="bullet"/>
-      <w:lvlText w:val=""/>
-      <w:lvlJc w:val="left"/>
-      <w:pPr>
-        <w:ind w:left="4981" w:hanging="440"/>
-      </w:pPr>
-      <w:rPr>
-        <w:rFonts w:ascii="Wingdings" w:hAnsi="Wingdings" w:hint="default"/>
-      </w:rPr>
-    </w:lvl>
-  </w:abstractNum>
-  <w:abstractNum w:abstractNumId="11" w15:restartNumberingAfterBreak="0">
+  <w:abstractNum w:abstractNumId="7" w15:restartNumberingAfterBreak="0">
     <w:nsid w:val="39A401C2"/>
     <w:multiLevelType w:val="hybridMultilevel"/>
     <w:tmpl w:val="9504492E"/>
@@ -7974,128 +5884,7 @@
       </w:pPr>
     </w:lvl>
   </w:abstractNum>
-  <w:abstractNum w:abstractNumId="12" w15:restartNumberingAfterBreak="0">
-    <w:nsid w:val="40722648"/>
-    <w:multiLevelType w:val="multilevel"/>
-    <w:tmpl w:val="88EE8CC4"/>
-    <w:lvl w:ilvl="0">
-      <w:start w:val="1"/>
-      <w:numFmt w:val="decimal"/>
-      <w:lvlText w:val="%1."/>
-      <w:lvlJc w:val="left"/>
-      <w:pPr>
-        <w:ind w:left="580" w:hanging="360"/>
-      </w:pPr>
-      <w:rPr>
-        <w:rFonts w:hint="default"/>
-      </w:rPr>
-    </w:lvl>
-    <w:lvl w:ilvl="1">
-      <w:start w:val="1"/>
-      <w:numFmt w:val="decimal"/>
-      <w:isLgl/>
-      <w:lvlText w:val="%1.%2."/>
-      <w:lvlJc w:val="left"/>
-      <w:pPr>
-        <w:ind w:left="800" w:hanging="360"/>
-      </w:pPr>
-      <w:rPr>
-        <w:rFonts w:hint="default"/>
-      </w:rPr>
-    </w:lvl>
-    <w:lvl w:ilvl="2">
-      <w:start w:val="1"/>
-      <w:numFmt w:val="decimal"/>
-      <w:isLgl/>
-      <w:lvlText w:val="%1.%2.%3."/>
-      <w:lvlJc w:val="left"/>
-      <w:pPr>
-        <w:ind w:left="1380" w:hanging="720"/>
-      </w:pPr>
-      <w:rPr>
-        <w:rFonts w:hint="default"/>
-      </w:rPr>
-    </w:lvl>
-    <w:lvl w:ilvl="3">
-      <w:start w:val="1"/>
-      <w:numFmt w:val="decimal"/>
-      <w:isLgl/>
-      <w:lvlText w:val="%1.%2.%3.%4."/>
-      <w:lvlJc w:val="left"/>
-      <w:pPr>
-        <w:ind w:left="1600" w:hanging="720"/>
-      </w:pPr>
-      <w:rPr>
-        <w:rFonts w:hint="default"/>
-      </w:rPr>
-    </w:lvl>
-    <w:lvl w:ilvl="4">
-      <w:start w:val="1"/>
-      <w:numFmt w:val="decimal"/>
-      <w:isLgl/>
-      <w:lvlText w:val="%1.%2.%3.%4.%5."/>
-      <w:lvlJc w:val="left"/>
-      <w:pPr>
-        <w:ind w:left="2180" w:hanging="1080"/>
-      </w:pPr>
-      <w:rPr>
-        <w:rFonts w:hint="default"/>
-      </w:rPr>
-    </w:lvl>
-    <w:lvl w:ilvl="5">
-      <w:start w:val="1"/>
-      <w:numFmt w:val="decimal"/>
-      <w:isLgl/>
-      <w:lvlText w:val="%1.%2.%3.%4.%5.%6."/>
-      <w:lvlJc w:val="left"/>
-      <w:pPr>
-        <w:ind w:left="2400" w:hanging="1080"/>
-      </w:pPr>
-      <w:rPr>
-        <w:rFonts w:hint="default"/>
-      </w:rPr>
-    </w:lvl>
-    <w:lvl w:ilvl="6">
-      <w:start w:val="1"/>
-      <w:numFmt w:val="decimal"/>
-      <w:isLgl/>
-      <w:lvlText w:val="%1.%2.%3.%4.%5.%6.%7."/>
-      <w:lvlJc w:val="left"/>
-      <w:pPr>
-        <w:ind w:left="2980" w:hanging="1440"/>
-      </w:pPr>
-      <w:rPr>
-        <w:rFonts w:hint="default"/>
-      </w:rPr>
-    </w:lvl>
-    <w:lvl w:ilvl="7">
-      <w:start w:val="1"/>
-      <w:numFmt w:val="decimal"/>
-      <w:isLgl/>
-      <w:lvlText w:val="%1.%2.%3.%4.%5.%6.%7.%8."/>
-      <w:lvlJc w:val="left"/>
-      <w:pPr>
-        <w:ind w:left="3200" w:hanging="1440"/>
-      </w:pPr>
-      <w:rPr>
-        <w:rFonts w:hint="default"/>
-      </w:rPr>
-    </w:lvl>
-    <w:lvl w:ilvl="8">
-      <w:start w:val="1"/>
-      <w:numFmt w:val="decimal"/>
-      <w:isLgl/>
-      <w:lvlText w:val="%1.%2.%3.%4.%5.%6.%7.%8.%9."/>
-      <w:lvlJc w:val="left"/>
-      <w:pPr>
-        <w:ind w:left="3780" w:hanging="1800"/>
-      </w:pPr>
-      <w:rPr>
-        <w:rFonts w:hint="default"/>
-      </w:rPr>
-    </w:lvl>
-  </w:abstractNum>
-  <w:abstractNum w:abstractNumId="13" w15:restartNumberingAfterBreak="0">
+  <w:abstractNum w:abstractNumId="8" w15:restartNumberingAfterBreak="0">
     <w:nsid w:val="57F87F73"/>
     <w:multiLevelType w:val="multilevel"/>
     <w:tmpl w:val="6E1EF64A"/>
@@ -8208,10 +5997,10 @@
       </w:rPr>
     </w:lvl>
   </w:abstractNum>
-  <w:abstractNum w:abstractNumId="14" w15:restartNumberingAfterBreak="0">
+  <w:abstractNum w:abstractNumId="9" w15:restartNumberingAfterBreak="0">
     <w:nsid w:val="5DF13183"/>
     <w:multiLevelType w:val="hybridMultilevel"/>
-    <w:tmpl w:val="AA8C37A8"/>
+    <w:tmpl w:val="5F247D94"/>
     <w:lvl w:ilvl="0" w:tplc="04090001">
       <w:start w:val="1"/>
       <w:numFmt w:val="bullet"/>
@@ -8321,7 +6110,7 @@
       </w:rPr>
     </w:lvl>
   </w:abstractNum>
-  <w:abstractNum w:abstractNumId="15" w15:restartNumberingAfterBreak="0">
+  <w:abstractNum w:abstractNumId="10" w15:restartNumberingAfterBreak="0">
     <w:nsid w:val="60AE384D"/>
     <w:multiLevelType w:val="hybridMultilevel"/>
     <w:tmpl w:val="B47EFE7C"/>
@@ -8410,7 +6199,7 @@
       </w:pPr>
     </w:lvl>
   </w:abstractNum>
-  <w:abstractNum w:abstractNumId="16" w15:restartNumberingAfterBreak="0">
+  <w:abstractNum w:abstractNumId="11" w15:restartNumberingAfterBreak="0">
     <w:nsid w:val="643062D4"/>
     <w:multiLevelType w:val="hybridMultilevel"/>
     <w:tmpl w:val="7402F382"/>
@@ -8499,7 +6288,7 @@
       </w:pPr>
     </w:lvl>
   </w:abstractNum>
-  <w:abstractNum w:abstractNumId="17" w15:restartNumberingAfterBreak="0">
+  <w:abstractNum w:abstractNumId="12" w15:restartNumberingAfterBreak="0">
     <w:nsid w:val="64A266DE"/>
     <w:multiLevelType w:val="hybridMultilevel"/>
     <w:tmpl w:val="ECC6245C"/>
@@ -8612,7 +6401,7 @@
       </w:rPr>
     </w:lvl>
   </w:abstractNum>
-  <w:abstractNum w:abstractNumId="18" w15:restartNumberingAfterBreak="0">
+  <w:abstractNum w:abstractNumId="13" w15:restartNumberingAfterBreak="0">
     <w:nsid w:val="67E33BA8"/>
     <w:multiLevelType w:val="hybridMultilevel"/>
     <w:tmpl w:val="63A89432"/>
@@ -8725,7 +6514,7 @@
       </w:rPr>
     </w:lvl>
   </w:abstractNum>
-  <w:abstractNum w:abstractNumId="19" w15:restartNumberingAfterBreak="0">
+  <w:abstractNum w:abstractNumId="14" w15:restartNumberingAfterBreak="0">
     <w:nsid w:val="79F5019A"/>
     <w:multiLevelType w:val="hybridMultilevel"/>
     <w:tmpl w:val="4BDA72C0"/>
@@ -8838,7 +6627,7 @@
       </w:rPr>
     </w:lvl>
   </w:abstractNum>
-  <w:abstractNum w:abstractNumId="20" w15:restartNumberingAfterBreak="0">
+  <w:abstractNum w:abstractNumId="15" w15:restartNumberingAfterBreak="0">
     <w:nsid w:val="7AE616E7"/>
     <w:multiLevelType w:val="hybridMultilevel"/>
     <w:tmpl w:val="C4741DDA"/>
@@ -8951,7 +6740,7 @@
       </w:rPr>
     </w:lvl>
   </w:abstractNum>
-  <w:abstractNum w:abstractNumId="21" w15:restartNumberingAfterBreak="0">
+  <w:abstractNum w:abstractNumId="16" w15:restartNumberingAfterBreak="0">
     <w:nsid w:val="7D4800CC"/>
     <w:multiLevelType w:val="hybridMultilevel"/>
     <w:tmpl w:val="2FE608B0"/>
@@ -9040,7 +6829,7 @@
       </w:pPr>
     </w:lvl>
   </w:abstractNum>
-  <w:abstractNum w:abstractNumId="22" w15:restartNumberingAfterBreak="0">
+  <w:abstractNum w:abstractNumId="17" w15:restartNumberingAfterBreak="0">
     <w:nsid w:val="7E236647"/>
     <w:multiLevelType w:val="multilevel"/>
     <w:tmpl w:val="14460DAE"/>
@@ -9153,7 +6942,7 @@
       </w:rPr>
     </w:lvl>
   </w:abstractNum>
-  <w:abstractNum w:abstractNumId="23" w15:restartNumberingAfterBreak="0">
+  <w:abstractNum w:abstractNumId="18" w15:restartNumberingAfterBreak="0">
     <w:nsid w:val="7E722B8F"/>
     <w:multiLevelType w:val="hybridMultilevel"/>
     <w:tmpl w:val="F72AB4A6"/>
@@ -9267,76 +7056,61 @@
     </w:lvl>
   </w:abstractNum>
   <w:num w:numId="1" w16cid:durableId="1698387077">
-    <w:abstractNumId w:val="23"/>
+    <w:abstractNumId w:val="18"/>
   </w:num>
   <w:num w:numId="2" w16cid:durableId="1463690833">
-    <w:abstractNumId w:val="17"/>
+    <w:abstractNumId w:val="12"/>
   </w:num>
   <w:num w:numId="3" w16cid:durableId="582029696">
-    <w:abstractNumId w:val="20"/>
+    <w:abstractNumId w:val="15"/>
   </w:num>
   <w:num w:numId="4" w16cid:durableId="2010016191">
-    <w:abstractNumId w:val="11"/>
+    <w:abstractNumId w:val="7"/>
   </w:num>
   <w:num w:numId="5" w16cid:durableId="1111434637">
-    <w:abstractNumId w:val="21"/>
+    <w:abstractNumId w:val="16"/>
   </w:num>
   <w:num w:numId="6" w16cid:durableId="1090540380">
-    <w:abstractNumId w:val="9"/>
+    <w:abstractNumId w:val="6"/>
   </w:num>
   <w:num w:numId="7" w16cid:durableId="1705665850">
-    <w:abstractNumId w:val="18"/>
+    <w:abstractNumId w:val="13"/>
   </w:num>
   <w:num w:numId="8" w16cid:durableId="2106655650">
-    <w:abstractNumId w:val="19"/>
+    <w:abstractNumId w:val="14"/>
   </w:num>
   <w:num w:numId="9" w16cid:durableId="622351625">
-    <w:abstractNumId w:val="16"/>
+    <w:abstractNumId w:val="11"/>
   </w:num>
   <w:num w:numId="10" w16cid:durableId="1650327625">
     <w:abstractNumId w:val="0"/>
   </w:num>
   <w:num w:numId="11" w16cid:durableId="1192766850">
-    <w:abstractNumId w:val="3"/>
+    <w:abstractNumId w:val="2"/>
   </w:num>
   <w:num w:numId="12" w16cid:durableId="661079388">
     <w:abstractNumId w:val="1"/>
   </w:num>
   <w:num w:numId="13" w16cid:durableId="2136634722">
-    <w:abstractNumId w:val="15"/>
+    <w:abstractNumId w:val="10"/>
   </w:num>
   <w:num w:numId="14" w16cid:durableId="456459249">
-    <w:abstractNumId w:val="13"/>
+    <w:abstractNumId w:val="8"/>
   </w:num>
   <w:num w:numId="15" w16cid:durableId="677120586">
-    <w:abstractNumId w:val="22"/>
+    <w:abstractNumId w:val="17"/>
   </w:num>
   <w:num w:numId="16" w16cid:durableId="1775401644">
-    <w:abstractNumId w:val="6"/>
+    <w:abstractNumId w:val="4"/>
   </w:num>
   <w:num w:numId="17" w16cid:durableId="728041148">
+    <w:abstractNumId w:val="3"/>
+  </w:num>
+  <w:num w:numId="18" w16cid:durableId="859121133">
     <w:abstractNumId w:val="5"/>
   </w:num>
-  <w:num w:numId="18" w16cid:durableId="859121133">
-    <w:abstractNumId w:val="7"/>
-  </w:num>
   <w:num w:numId="19" w16cid:durableId="1983119712">
-    <w:abstractNumId w:val="14"/>
-  </w:num>
-  <w:num w:numId="20" w16cid:durableId="1709531196">
-    <w:abstractNumId w:val="2"/>
-  </w:num>
-  <w:num w:numId="21" w16cid:durableId="552958989">
-    <w:abstractNumId w:val="12"/>
-  </w:num>
-  <w:num w:numId="22" w16cid:durableId="771781032">
-    <w:abstractNumId w:val="10"/>
-  </w:num>
-  <w:num w:numId="23" w16cid:durableId="260140940">
-    <w:abstractNumId w:val="8"/>
-  </w:num>
-  <w:num w:numId="24" w16cid:durableId="1134561133">
-    <w:abstractNumId w:val="4"/>
+    <w:abstractNumId w:val="9"/>
   </w:num>
 </w:numbering>
 </file>

</xml_diff>